<commit_message>
Use real presenter names and make Sprechtext sound natural
- Replace Person A/B/C placeholders everywhere with the actual
  presenters: Max Manahl, Simon Schick, Daniel Kornfeld (title slide,
  closing slide, corner name badges, speaker notes)
- Widen and resize the corner name badge to fit full names
- Rewrite the speaker script (sprechtext.md/.docx) to sound like
  natural spoken German instead of a stiff script: dropped the
  repetitive "Übergabe an X" tag, loosened formal listy phrasing,
  varied transitions, used first names in dialogue
</commit_message>
<xml_diff>
--- a/kombinatorik-praesentation/sprechtext.docx
+++ b/kombinatorik-praesentation/sprechtext.docx
@@ -25,7 +25,7 @@
           <w:color w:val="64748B"/>
           <w:sz w:val="21"/>
         </w:rPr>
-        <w:t>Vollständiges Sprechskript für alle 18 Folien. A → B → C rotierend. Zieldauer: ca. 20–25 Minuten (Zeitangaben sind Richtwerte).</w:t>
+        <w:t>Max Manahl (A) -&gt; Simon Schick (B) -&gt; Daniel Kornfeld (C), rotierend durch alle 18 Folien. Zieldauer: ca. 20-25 Minuten (Zeitangaben sind Richtwerte).</w:t>
       </w:r>
     </w:p>
     <w:p>
@@ -38,7 +38,7 @@
           <w:color w:val="64748B"/>
           <w:sz w:val="21"/>
         </w:rPr>
-        <w:t>Hinweis: Das ist ein Gerüst zum Üben, nicht zum Ablesen! Lest es ein paar Mal durch, dann sagt es mit euren eigenen Worten – das wirkt natürlicher und ihr wirkt sicherer.</w:t>
+        <w:t>Hinweis: Das hier ist eine Gedankenstütze, kein Text zum Ablesen. Lest es ein paar Mal durch und erzählt es dann mit euren eigenen Worten nach – das klingt automatisch lockerer und natürlicher, als wenn ihr es Wort für Wort vortragt.</w:t>
       </w:r>
     </w:p>
     <w:p>
@@ -59,7 +59,7 @@
           <w:color w:val="1E3A8A"/>
           <w:sz w:val="32"/>
         </w:rPr>
-        <w:t>Folie 1 – Titelfolie (Person Alle)</w:t>
+        <w:t>Folie 1 – Titelfolie (Alle)</w:t>
       </w:r>
     </w:p>
     <w:p>
@@ -85,14 +85,14 @@
           <w:color w:val="1E3A8A"/>
           <w:sz w:val="23"/>
         </w:rPr>
-        <w:t xml:space="preserve">Person A: </w:t>
+        <w:t xml:space="preserve">Max: </w:t>
       </w:r>
       <w:r>
         <w:rPr>
           <w:color w:val="0F172A"/>
           <w:sz w:val="23"/>
         </w:rPr>
-        <w:t>Hallo zusammen! Wir drei – [Name A], [Name B] und [Name C] – nehmen euch heute mit in die Welt der Kombinatorik und Wahrscheinlichkeit.</w:t>
+        <w:t>Hallo zusammen! Wir sind Max, Simon und Daniel, und wir nehmen euch heute mit in die Welt der Kombinatorik und Wahrscheinlichkeit.</w:t>
       </w:r>
     </w:p>
     <w:p>
@@ -105,14 +105,14 @@
           <w:color w:val="EA580C"/>
           <w:sz w:val="23"/>
         </w:rPr>
-        <w:t xml:space="preserve">Person B: </w:t>
+        <w:t xml:space="preserve">Simon: </w:t>
       </w:r>
       <w:r>
         <w:rPr>
           <w:color w:val="0F172A"/>
           <w:sz w:val="23"/>
         </w:rPr>
-        <w:t>Die zentrale Frage, um die es heute geht: Wie viele Möglichkeiten gibt es eigentlich wirklich – und warum sind das fast immer viel mehr, als man im Kopf schätzt?</w:t>
+        <w:t>Es geht im Grunde um eine Frage: Wie viele Möglichkeiten gibt es eigentlich wirklich – und warum ist das fast immer viel mehr, als man im ersten Moment denkt?</w:t>
       </w:r>
     </w:p>
     <w:p>
@@ -125,14 +125,14 @@
           <w:color w:val="2563EB"/>
           <w:sz w:val="23"/>
         </w:rPr>
-        <w:t xml:space="preserve">Person C: </w:t>
+        <w:t xml:space="preserve">Daniel: </w:t>
       </w:r>
       <w:r>
         <w:rPr>
           <w:color w:val="0F172A"/>
           <w:sz w:val="23"/>
         </w:rPr>
-        <w:t>Es wird nicht nur trockene Theorie, sondern auch ein praktischer Teil, bei dem ihr mitraten dürft. Legen wir los!</w:t>
+        <w:t>Wird nicht nur Theorie, es gibt auch einen Teil, wo ihr selbst mitraten müsst. Legen wir los.</w:t>
       </w:r>
     </w:p>
     <w:p>
@@ -153,7 +153,7 @@
           <w:color w:val="1E3A8A"/>
           <w:sz w:val="32"/>
         </w:rPr>
-        <w:t>Folie 2 – Agenda &amp; Einstiegsfragen (Person A)</w:t>
+        <w:t>Folie 2 – Agenda &amp; Einstiegsfragen (Max Manahl)</w:t>
       </w:r>
     </w:p>
     <w:p>
@@ -179,14 +179,14 @@
           <w:color w:val="1E3A8A"/>
           <w:sz w:val="23"/>
         </w:rPr>
-        <w:t xml:space="preserve">Person A: </w:t>
+        <w:t xml:space="preserve">Max: </w:t>
       </w:r>
       <w:r>
         <w:rPr>
           <w:color w:val="0F172A"/>
           <w:sz w:val="23"/>
         </w:rPr>
-        <w:t>Kurz zur Agenda: Wir starten beim Zählprinzip, das die Basis für alles Weitere ist. Danach schauen wir uns Permutation, Variation und Kombination an – das sind die drei großen Werkzeuge der Kombinatorik. Dann verbinden wir das mit dem Pascal'schen Dreieck und der Laplace-Wahrscheinlichkeit. Zum Schluss gibt's einen praktischen Teil, bei dem ihr aktiv mitmachen müsst.</w:t>
+        <w:t>Kurz zur Agenda, damit ihr wisst, was kommt: Wir starten beim Zählprinzip, das ist quasi die Basis für alles Weitere. Danach geht's um Permutation, Variation und Kombination, dann verbinden wir das mit dem Pascal'schen Dreieck und der Laplace-Wahrscheinlichkeit. Und ganz am Schluss gibt's einen praktischen Teil, bei dem ihr wirklich mitmachen müsst.</w:t>
       </w:r>
     </w:p>
     <w:p>
@@ -199,14 +199,14 @@
           <w:color w:val="1E3A8A"/>
           <w:sz w:val="23"/>
         </w:rPr>
-        <w:t xml:space="preserve">Person A: </w:t>
+        <w:t xml:space="preserve">Max: </w:t>
       </w:r>
       <w:r>
         <w:rPr>
           <w:color w:val="0F172A"/>
           <w:sz w:val="23"/>
         </w:rPr>
-        <w:t>Bevor wir inhaltlich einsteigen, möchte ich euch drei Fragen stellen. Ihr müsst nichts sagen oder aufschreiben – schätzt einfach kurz im Kopf, und merkt euch eure Schätzung.</w:t>
+        <w:t>Aber bevor wir starten, will ich euch noch drei Fragen stellen. Müsst nichts sagen, einfach kurz im Kopf schätzen und euch die Zahl merken.</w:t>
       </w:r>
     </w:p>
     <w:p>
@@ -219,14 +219,14 @@
           <w:color w:val="1E3A8A"/>
           <w:sz w:val="23"/>
         </w:rPr>
-        <w:t xml:space="preserve">Person A: </w:t>
+        <w:t xml:space="preserve">Max: </w:t>
       </w:r>
       <w:r>
         <w:rPr>
           <w:color w:val="0F172A"/>
           <w:sz w:val="23"/>
         </w:rPr>
-        <w:t>Erste Frage: Wie viele verschiedene 4-stellige PIN-Codes gibt es überhaupt?</w:t>
+        <w:t>Wie viele verschiedene 4-stellige PIN-Codes gibt's überhaupt?</w:t>
       </w:r>
     </w:p>
     <w:p>
@@ -252,14 +252,14 @@
           <w:color w:val="1E3A8A"/>
           <w:sz w:val="23"/>
         </w:rPr>
-        <w:t xml:space="preserve">Person A: </w:t>
+        <w:t xml:space="preserve">Max: </w:t>
       </w:r>
       <w:r>
         <w:rPr>
           <w:color w:val="0F172A"/>
           <w:sz w:val="23"/>
         </w:rPr>
-        <w:t>Zweite Frage: Stellt euch vor, ihr alle in dieser Klasse tauscht gegenseitig eure Handynummern aus – jede Person mit jeder anderen, einmal. Wie viele Austausche finden dabei insgesamt statt?</w:t>
+        <w:t>Dann: Stellt euch vor, ihr alle hier in der Klasse tauscht gegenseitig eure Handynummern aus, jeder mit jedem einmal. Wie viele Austausche sind das am Ende insgesamt?</w:t>
       </w:r>
     </w:p>
     <w:p>
@@ -285,14 +285,14 @@
           <w:color w:val="1E3A8A"/>
           <w:sz w:val="23"/>
         </w:rPr>
-        <w:t xml:space="preserve">Person A: </w:t>
+        <w:t xml:space="preserve">Max: </w:t>
       </w:r>
       <w:r>
         <w:rPr>
           <w:color w:val="0F172A"/>
           <w:sz w:val="23"/>
         </w:rPr>
-        <w:t>Und drittens: Wie wahrscheinlich ist es, beim Lotto 6 aus 45 einen Sechser zu haben?</w:t>
+        <w:t>Und die letzte: Wie wahrscheinlich ist eigentlich ein Sechser beim Lotto 6 aus 45?</w:t>
       </w:r>
     </w:p>
     <w:p>
@@ -318,14 +318,14 @@
           <w:color w:val="1E3A8A"/>
           <w:sz w:val="23"/>
         </w:rPr>
-        <w:t xml:space="preserve">Person A: </w:t>
+        <w:t xml:space="preserve">Max: </w:t>
       </w:r>
       <w:r>
         <w:rPr>
           <w:color w:val="0F172A"/>
           <w:sz w:val="23"/>
         </w:rPr>
-        <w:t>Behaltet eure drei Schätzungen im Kopf – wir werden sie im Laufe der Präsentation Stück für Stück auflösen. Ich gebe jetzt weiter an [Name B] für das Zählprinzip.</w:t>
+        <w:t>Merkt euch eure drei Schätzungen, wir lösen die nach und nach im Laufe der Präsentation auf. Simon erklärt jetzt das Zählprinzip.</w:t>
       </w:r>
     </w:p>
     <w:p>
@@ -346,7 +346,7 @@
           <w:color w:val="1E3A8A"/>
           <w:sz w:val="32"/>
         </w:rPr>
-        <w:t>Folie 3 – Das Zählprinzip (Person B)</w:t>
+        <w:t>Folie 3 – Das Zählprinzip (Simon Schick)</w:t>
       </w:r>
     </w:p>
     <w:p>
@@ -372,14 +372,14 @@
           <w:color w:val="EA580C"/>
           <w:sz w:val="23"/>
         </w:rPr>
-        <w:t xml:space="preserve">Person B: </w:t>
+        <w:t xml:space="preserve">Simon: </w:t>
       </w:r>
       <w:r>
         <w:rPr>
           <w:color w:val="0F172A"/>
           <w:sz w:val="23"/>
         </w:rPr>
-        <w:t>Das Zählprinzip ist die Grundlage von allem, was heute noch kommt. Die Idee dahinter ist eigentlich ganz simpel: Wenn ein Vorgang aus mehreren Schritten besteht, und es für jeden Schritt mehrere Möglichkeiten gibt, dann multipliziert man einfach die Anzahl der Möglichkeiten pro Schritt.</w:t>
+        <w:t>Das Zählprinzip ist die Grundlage für so gut wie alles, was heute noch kommt, und die Idee dahinter ist eigentlich ziemlich simpel: Besteht etwas aus mehreren Schritten, und gibt's für jeden Schritt mehrere Möglichkeiten, multipliziert man einfach die Möglichkeiten pro Schritt.</w:t>
       </w:r>
     </w:p>
     <w:p>
@@ -392,14 +392,14 @@
           <w:color w:val="EA580C"/>
           <w:sz w:val="23"/>
         </w:rPr>
-        <w:t xml:space="preserve">Person B: </w:t>
+        <w:t xml:space="preserve">Simon: </w:t>
       </w:r>
       <w:r>
         <w:rPr>
           <w:color w:val="0F172A"/>
           <w:sz w:val="23"/>
         </w:rPr>
-        <w:t>Schauen wir uns das an einem Beispiel an, das jeder kennt: Sich morgens anziehen. Sagen wir, ich habe 3 Hemden, 4 Hosen und 2 Paar Schuhe zur Auswahl. Wie viele komplette Outfits kann ich daraus zusammenstellen?</w:t>
+        <w:t>Nehmen wir was ganz Alltägliches: sich Anziehen am Morgen. Sagen wir, ich hab 3 Hemden, 4 Hosen und 2 Paar Schuhe zur Auswahl – wie viele komplette Outfits kann ich mir daraus zusammenstellen?</w:t>
       </w:r>
     </w:p>
     <w:p>
@@ -412,14 +412,14 @@
           <w:color w:val="EA580C"/>
           <w:sz w:val="23"/>
         </w:rPr>
-        <w:t xml:space="preserve">Person B: </w:t>
+        <w:t xml:space="preserve">Simon: </w:t>
       </w:r>
       <w:r>
         <w:rPr>
           <w:color w:val="0F172A"/>
           <w:sz w:val="23"/>
         </w:rPr>
-        <w:t>Man könnte jetzt anfangen, alles einzeln durchzuzählen – aber das Zählprinzip macht es viel einfacher: 3 Hemden mal 4 Hosen ergibt 12 mögliche Hemd-Hosen-Kombinationen – das seht ihr auch im Raster hier rechts. Jede dieser 12 Kombinationen kann ich jetzt noch mit 2 verschiedenen Schuhen kombinieren. Also: 3 mal 4 mal 2 gleich 24 Outfits.</w:t>
+        <w:t>Man könnte das jetzt alles einzeln aufzählen, aber es geht einfacher: 3 Hemden mal 4 Hosen, das sind schon mal 12 Hemd-Hosen-Kombinationen – seht ihr auch im Raster da rechts. Und jede davon kann ich noch mit 2 Schuhen kombinieren. Macht 3 mal 4 mal 2, also 24 Outfits.</w:t>
       </w:r>
     </w:p>
     <w:p>
@@ -432,14 +432,14 @@
           <w:color w:val="EA580C"/>
           <w:sz w:val="23"/>
         </w:rPr>
-        <w:t xml:space="preserve">Person B: </w:t>
+        <w:t xml:space="preserve">Simon: </w:t>
       </w:r>
       <w:r>
         <w:rPr>
           <w:color w:val="0F172A"/>
           <w:sz w:val="23"/>
         </w:rPr>
-        <w:t>Das Zählprinzip ist wirklich die Basis – Permutation, Variation und Kombination, die jetzt kommen, sind im Grunde nur spezielle, klar definierte Anwendungsfälle genau dieses Prinzips. Ich gebe weiter an [Name C].</w:t>
+        <w:t>Und das Wichtige dabei: Permutation, Variation und Kombination, die gleich kommen, sind im Grunde nichts anderes als spezielle Fälle von genau diesem Prinzip hier. Daniel zeigt euch jetzt die Permutation.</w:t>
       </w:r>
     </w:p>
     <w:p>
@@ -460,7 +460,7 @@
           <w:color w:val="1E3A8A"/>
           <w:sz w:val="32"/>
         </w:rPr>
-        <w:t>Folie 4 – Permutation (Person C)</w:t>
+        <w:t>Folie 4 – Permutation (Daniel Kornfeld)</w:t>
       </w:r>
     </w:p>
     <w:p>
@@ -486,14 +486,14 @@
           <w:color w:val="2563EB"/>
           <w:sz w:val="23"/>
         </w:rPr>
-        <w:t xml:space="preserve">Person C: </w:t>
+        <w:t xml:space="preserve">Daniel: </w:t>
       </w:r>
       <w:r>
         <w:rPr>
           <w:color w:val="0F172A"/>
           <w:sz w:val="23"/>
         </w:rPr>
-        <w:t>Bei der Permutation geht es darum, alle Elemente einer Menge in eine Reihenfolge zu bringen – jede Position zählt.</w:t>
+        <w:t>Bei der Permutation bringen wir alle Elemente in eine Reihenfolge – jede Position zählt dabei.</w:t>
       </w:r>
     </w:p>
     <w:p>
@@ -506,14 +506,14 @@
           <w:color w:val="2563EB"/>
           <w:sz w:val="23"/>
         </w:rPr>
-        <w:t xml:space="preserve">Person C: </w:t>
+        <w:t xml:space="preserve">Daniel: </w:t>
       </w:r>
       <w:r>
         <w:rPr>
           <w:color w:val="0F172A"/>
           <w:sz w:val="23"/>
         </w:rPr>
-        <w:t>Schauen wir uns das zuerst ohne Wiederholung an, am Beispiel von 3 Freunden – A, B und C – die sich nebeneinander hinsetzen. Im Baumdiagramm seht ihr: Für die erste Position gibt es 3 Möglichkeiten, für die zweite noch 2, und für die letzte bleibt nur noch 1 übrig. Das ergibt 3 mal 2 mal 1, also 3 Fakultät, gleich 6 mögliche Sitzordnungen. Allgemein gilt: Die Anzahl der Reihenfolgen von n Elementen ist P(n) gleich n Fakultät. Bei 5 Personen am Tisch wären das schon 5 Fakultät, also 120 Sitzordnungen – die Zahl wächst extrem schnell, das werden wir später noch genauer sehen.</w:t>
+        <w:t>Schauen wir uns zuerst die Variante ohne Wiederholung an, an 3 Freunden – A, B und C –, die sich nebeneinandersetzen. Im Baumdiagramm seht ihr's: für den ersten Platz gibt's 3 Möglichkeiten, für den zweiten nur noch 2, und für den letzten bleibt eh nur noch einer übrig. 3 mal 2 mal 1, also 3 Fakultät, gleich 6 Sitzordnungen. Ganz allgemein: P(n) gleich n Fakultät. Bei 5 Leuten am Tisch wären das schon 120 – das wächst echt schnell, dazu kommen wir später noch.</w:t>
       </w:r>
     </w:p>
     <w:p>
@@ -526,14 +526,14 @@
           <w:color w:val="2563EB"/>
           <w:sz w:val="23"/>
         </w:rPr>
-        <w:t xml:space="preserve">Person C: </w:t>
+        <w:t xml:space="preserve">Daniel: </w:t>
       </w:r>
       <w:r>
         <w:rPr>
           <w:color w:val="0F172A"/>
           <w:sz w:val="23"/>
         </w:rPr>
-        <w:t>Jetzt zur Permutation mit Wiederholung: Hier kommen manche Elemente mehrfach vor, und dann muss man durch die Fakultäten dieser Wiederholungen teilen, weil sonst Reihenfolgen doppelt gezählt würden, die eigentlich gleich aussehen.</w:t>
+        <w:t>Jetzt die Variante mit Wiederholung: Wenn manche Elemente mehrfach vorkommen, müssen wir durch deren Fakultäten teilen, sonst zählen wir Reihenfolgen doppelt, die eigentlich gleich aussehen.</w:t>
       </w:r>
     </w:p>
     <w:p>
@@ -546,14 +546,14 @@
           <w:color w:val="2563EB"/>
           <w:sz w:val="23"/>
         </w:rPr>
-        <w:t xml:space="preserve">Person C: </w:t>
+        <w:t xml:space="preserve">Daniel: </w:t>
       </w:r>
       <w:r>
         <w:rPr>
           <w:color w:val="0F172A"/>
           <w:sz w:val="23"/>
         </w:rPr>
-        <w:t>Bestes Beispiel: das Wort ANANAS. 6 Buchstaben insgesamt, aber das A kommt 3 mal vor und das N 2 mal. Wenn wir einfach 6 Fakultät rechnen würden, hätten wir viel zu viele Anordnungen gezählt – weil ein Vertauschen der drei A's untereinander ja optisch gar keinen Unterschied macht. Deshalb teilen wir 6 Fakultät durch 3 Fakultät mal 2 Fakultät mal 1 Fakultät, und kommen auf 60 verschiedene Anordnungen des Wortes ANANAS. Weiter geht's mit [Name A] und der Variation.</w:t>
+        <w:t>Bestes Beispiel dafür ist ANANAS. 6 Buchstaben, aber das A kommt 3 mal vor und das N 2 mal. Würden wir einfach 6 Fakultät rechnen, hätten wir viel zu viel gezählt, weil es ja optisch keinen Unterschied macht, wenn man die drei A's untereinander vertauscht. Deshalb teilt man 6 Fakultät durch 3 Fakultät mal 2 Fakultät mal 1 Fakultät – kommt man auf 60 Anordnungen. Max macht jetzt mit der Variation weiter.</w:t>
       </w:r>
     </w:p>
     <w:p>
@@ -574,7 +574,7 @@
           <w:color w:val="1E3A8A"/>
           <w:sz w:val="32"/>
         </w:rPr>
-        <w:t>Folie 5 – Variation (Person A)</w:t>
+        <w:t>Folie 5 – Variation (Max Manahl)</w:t>
       </w:r>
     </w:p>
     <w:p>
@@ -600,14 +600,14 @@
           <w:color w:val="1E3A8A"/>
           <w:sz w:val="23"/>
         </w:rPr>
-        <w:t xml:space="preserve">Person A: </w:t>
+        <w:t xml:space="preserve">Max: </w:t>
       </w:r>
       <w:r>
         <w:rPr>
           <w:color w:val="0F172A"/>
           <w:sz w:val="23"/>
         </w:rPr>
-        <w:t>Bei der Variation wählen wir nur einen Teil – k von n Elementen – aus, und die Reihenfolge ist wichtig.</w:t>
+        <w:t>Bei der Variation wählen wir nur einen Teil aus – k von n Elementen –, aber die Reihenfolge spielt eine Rolle.</w:t>
       </w:r>
     </w:p>
     <w:p>
@@ -620,14 +620,14 @@
           <w:color w:val="1E3A8A"/>
           <w:sz w:val="23"/>
         </w:rPr>
-        <w:t xml:space="preserve">Person A: </w:t>
+        <w:t xml:space="preserve">Max: </w:t>
       </w:r>
       <w:r>
         <w:rPr>
           <w:color w:val="0F172A"/>
           <w:sz w:val="23"/>
         </w:rPr>
-        <w:t>Ohne Wiederholung heißt: kein Element darf doppelt gewählt werden, wie beim Ziehen ohne Zurücklegen. Klassisches Beispiel: ein Wettlauf mit 8 Läuferinnen und Läufern, aber nur die Plätze 1 bis 3 zählen fürs Stockerl. Reihenfolge ist hier extrem wichtig – Gold, Silber und Bronze sind nicht gleich! Für Platz 1 gibt es 8 Möglichkeiten, für Platz 2 noch 7, für Platz 3 noch 6. Das ergibt V(8,3) gleich 8 mal 7 mal 6, also 336 mögliche Stockerl-Besetzungen – aus nur 8 Personen!</w:t>
+        <w:t>Ohne Wiederholung heißt, kein Element darf doppelt gewählt werden, wie beim Ziehen ohne Zurücklegen. Stellt euch einen Wettlauf mit 8 Läuferinnen und Läufern vor, aber nur die Plätze 1 bis 3 zählen fürs Stockerl. Reihenfolge ist hier extrem wichtig, Gold ist nicht Silber. Für Platz 1 gibt's 8 Möglichkeiten, für Platz 2 noch 7, für Platz 3 noch 6 – macht 8 mal 7 mal 6, also 336 mögliche Stockerl-Besetzungen, aus nur 8 Leuten.</w:t>
       </w:r>
     </w:p>
     <w:p>
@@ -640,14 +640,14 @@
           <w:color w:val="1E3A8A"/>
           <w:sz w:val="23"/>
         </w:rPr>
-        <w:t xml:space="preserve">Person A: </w:t>
+        <w:t xml:space="preserve">Max: </w:t>
       </w:r>
       <w:r>
         <w:rPr>
           <w:color w:val="0F172A"/>
           <w:sz w:val="23"/>
         </w:rPr>
-        <w:t>Jetzt zur Variation mit Wiederholung: Hier darf jede Stelle erneut aus allen n Möglichkeiten gewählt werden, ganz unabhängig von den vorherigen Stellen.</w:t>
+        <w:t>Mit Wiederholung darf jede Stelle wieder aus allen n Möglichkeiten gewählt werden, ganz unabhängig davon, was vorher schon dran war.</w:t>
       </w:r>
     </w:p>
     <w:p>
@@ -660,14 +660,14 @@
           <w:color w:val="1E3A8A"/>
           <w:sz w:val="23"/>
         </w:rPr>
-        <w:t xml:space="preserve">Person A: </w:t>
+        <w:t xml:space="preserve">Max: </w:t>
       </w:r>
       <w:r>
         <w:rPr>
           <w:color w:val="0F172A"/>
           <w:sz w:val="23"/>
         </w:rPr>
-        <w:t>Und damit lösen wir jetzt unsere allererste Frage von vorhin auf: Wie viele 4-stellige PIN-Codes gibt es? Jede der 4 Stellen kann eine Ziffer von 0 bis 9 sein, und Wiederholungen sind erlaubt – man kann ja z.B. 1-1-1-1 als PIN haben. Das ergibt 10 hoch 4, also genau 10.000 mögliche PIN-Codes. Vergleicht das mal mit eurer Schätzung von vorhin! Übergabe an [Name B] für die Kombination.</w:t>
+        <w:t>Und damit können wir die allererste Frage von vorhin auflösen: 4-stellige PIN-Codes. Jede der 4 Stellen kann eine Ziffer von 0 bis 9 sein, und Wiederholung ist erlaubt – 1-1-1-1 geht ja auch. Also 10 hoch 4, macht genau 10.000 mögliche PINs. Schaut mal, wie nah ihr mit eurer Schätzung dran wart. Simon erklärt jetzt die Kombination.</w:t>
       </w:r>
     </w:p>
     <w:p>
@@ -688,7 +688,7 @@
           <w:color w:val="1E3A8A"/>
           <w:sz w:val="32"/>
         </w:rPr>
-        <w:t>Folie 6 – Kombination (Person B)</w:t>
+        <w:t>Folie 6 – Kombination (Simon Schick)</w:t>
       </w:r>
     </w:p>
     <w:p>
@@ -714,14 +714,14 @@
           <w:color w:val="EA580C"/>
           <w:sz w:val="23"/>
         </w:rPr>
-        <w:t xml:space="preserve">Person B: </w:t>
+        <w:t xml:space="preserve">Simon: </w:t>
       </w:r>
       <w:r>
         <w:rPr>
           <w:color w:val="0F172A"/>
           <w:sz w:val="23"/>
         </w:rPr>
-        <w:t>Bei der Kombination ist – im Unterschied zu Permutation und Variation – die Reihenfolge völlig egal. Uns interessiert nur, WELCHE Elemente ausgewählt wurden, nicht WANN oder in welcher Reihenfolge.</w:t>
+        <w:t>Bei der Kombination ist die Reihenfolge – anders als bei Variation und Permutation – komplett egal. Uns interessiert nur, welche Elemente überhaupt gewählt wurden, nicht in welcher Reihenfolge.</w:t>
       </w:r>
     </w:p>
     <w:p>
@@ -734,14 +734,14 @@
           <w:color w:val="EA580C"/>
           <w:sz w:val="23"/>
         </w:rPr>
-        <w:t xml:space="preserve">Person B: </w:t>
+        <w:t xml:space="preserve">Simon: </w:t>
       </w:r>
       <w:r>
         <w:rPr>
           <w:color w:val="0F172A"/>
           <w:sz w:val="23"/>
         </w:rPr>
-        <w:t>Schauen wir uns das ohne Wiederholung an unserer zweiten Frage von ganz am Anfang an: Wenn ihr alle 15 Schüler:innen in dieser Klasse gegenseitig eure Handynummern austauscht – wie viele Austausche sind das insgesamt? Wichtig hier: Wenn A mit B tauscht, ist das dasselbe wie wenn B mit A tauscht – die Reihenfolge ist egal, deshalb ist das eine Kombination, keine Variation! Wir wählen 2 Personen aus 15 aus, ohne dass die Reihenfolge zählt. Das ergibt 15 über 2, also 15 Fakultät durch 2 Fakultät mal 13 Fakultät, und das macht genau 105 Austausche.</w:t>
+        <w:t>Damit lösen wir gleich unsere zweite Frage von vorhin auf: Ihr seid 15 Leute in dieser Klasse, und jeder tauscht mit jedem die Handynummer. Wie viele Austausche sind das? Wichtig: Wenn ich mit dir tausche, ist das dasselbe, als würdest du mit mir tauschen – die Reihenfolge ist egal, darum ist das eine Kombination und keine Variation. Wir wählen 2 aus 15 aus, ohne dass die Reihenfolge zählt: 15 über 2, also 15 Fakultät durch 2 Fakultät mal 13 Fakultät – und das macht genau 105.</w:t>
       </w:r>
     </w:p>
     <w:p>
@@ -767,14 +767,14 @@
           <w:color w:val="EA580C"/>
           <w:sz w:val="23"/>
         </w:rPr>
-        <w:t xml:space="preserve">Person B: </w:t>
+        <w:t xml:space="preserve">Simon: </w:t>
       </w:r>
       <w:r>
         <w:rPr>
           <w:color w:val="0F172A"/>
           <w:sz w:val="23"/>
         </w:rPr>
-        <w:t>105! Die meisten schätzen hier viel zu niedrig – irgendwo bei 15 oder vielleicht 30. Aber weil jede Person mit jeder anderen tauscht, wächst das viel schneller als man denkt. Das war Frage Nummer 2 von ganz am Anfang.</w:t>
+        <w:t>105! Die meisten schätzen da viel zu niedrig, irgendwo bei 15 oder 30. Aber weil wirklich jeder mit jedem tauscht, wächst das viel schneller, als man im ersten Moment denkt.</w:t>
       </w:r>
     </w:p>
     <w:p>
@@ -787,14 +787,14 @@
           <w:color w:val="EA580C"/>
           <w:sz w:val="23"/>
         </w:rPr>
-        <w:t xml:space="preserve">Person B: </w:t>
+        <w:t xml:space="preserve">Simon: </w:t>
       </w:r>
       <w:r>
         <w:rPr>
           <w:color w:val="0F172A"/>
           <w:sz w:val="23"/>
         </w:rPr>
-        <w:t>Jetzt noch kurz die Kombination mit Wiederholung, am Beispiel eines Eisbechers: Wir wählen 3 Kugeln aus 5 Sorten, und dabei dürfen auch mehrere Kugeln derselben Sorte gewählt werden – zum Beispiel 3 mal Schoko. Mit der Formel für Kombination mit Wiederholung kommen wir hier auf 35 mögliche Eisbecher-Zusammenstellungen. Weiter zu [Name C] und dem Pascal'schen Dreieck.</w:t>
+        <w:t>Kurz noch die Variante mit Wiederholung, am Beispiel Eisbecher: Wir wählen 3 Kugeln aus 5 Sorten, und es dürfen auch mehrere Kugeln derselben Sorte dabei sein, zum Beispiel 3 mal Schoko. Mit der Formel kommt man da auf 35 mögliche Eisbecher. Daniel zeigt euch jetzt das Pascal'sche Dreieck.</w:t>
       </w:r>
     </w:p>
     <w:p>
@@ -815,7 +815,7 @@
           <w:color w:val="1E3A8A"/>
           <w:sz w:val="32"/>
         </w:rPr>
-        <w:t>Folie 7 – Pascal'sches Dreieck (Person C)</w:t>
+        <w:t>Folie 7 – Pascal'sches Dreieck (Daniel Kornfeld)</w:t>
       </w:r>
     </w:p>
     <w:p>
@@ -841,14 +841,14 @@
           <w:color w:val="2563EB"/>
           <w:sz w:val="23"/>
         </w:rPr>
-        <w:t xml:space="preserve">Person C: </w:t>
+        <w:t xml:space="preserve">Daniel: </w:t>
       </w:r>
       <w:r>
         <w:rPr>
           <w:color w:val="0F172A"/>
           <w:sz w:val="23"/>
         </w:rPr>
-        <w:t>Das Pascal'sche Dreieck ist im Grunde eine fertige Tabelle für alle Binomialkoeffizienten – also für alle 'n über k'-Werte, die wir bei der Kombination brauchen.</w:t>
+        <w:t>Das Pascal'sche Dreieck ist im Grunde eine fertige Tabelle für alle Binomialkoeffizienten – also für all die 'n über k'-Werte, die wir bei der Kombination gebraucht haben.</w:t>
       </w:r>
     </w:p>
     <w:p>
@@ -861,14 +861,14 @@
           <w:color w:val="2563EB"/>
           <w:sz w:val="23"/>
         </w:rPr>
-        <w:t xml:space="preserve">Person C: </w:t>
+        <w:t xml:space="preserve">Daniel: </w:t>
       </w:r>
       <w:r>
         <w:rPr>
           <w:color w:val="0F172A"/>
           <w:sz w:val="23"/>
         </w:rPr>
-        <w:t>Die Regel, nach der es aufgebaut ist, ist eine Rekursionsformel: Jede Zahl im Dreieck ist die Summe der zwei Zahlen direkt darüber. n über k ist also gleich n-minus-1 über k-minus-1, plus n-minus-1 über k.</w:t>
+        <w:t>Aufgebaut ist es nach einer ganz einfachen Regel: Jede Zahl ist die Summe der beiden Zahlen direkt darüber. n über k ist also n-minus-1 über k-minus-1 plus n-minus-1 über k.</w:t>
       </w:r>
     </w:p>
     <w:p>
@@ -881,14 +881,14 @@
           <w:color w:val="2563EB"/>
           <w:sz w:val="23"/>
         </w:rPr>
-        <w:t xml:space="preserve">Person C: </w:t>
+        <w:t xml:space="preserve">Daniel: </w:t>
       </w:r>
       <w:r>
         <w:rPr>
           <w:color w:val="0F172A"/>
           <w:sz w:val="23"/>
         </w:rPr>
-        <w:t>Schaut euch die orange markierte 15 im Dreieck an – das ist genau 6 über 2. Erkennt ihr das wieder? Genauso haben wir vorhin beim Lotto-Beispiel mit Binomialkoeffizienten gerechnet. Das Dreieck ist also nicht nur eine mathematische Spielerei, sondern ein super praktisches Hilfsmittel, wenn man schnell einen Binomialkoeffizienten ohne Taschenrechner abschätzen will. Übergabe an [Name A] für die Laplace-Wahrscheinlichkeit.</w:t>
+        <w:t>Schaut euch mal die orange 15 im Dreieck an – das ist genau 6 über 2. Kommt euch das bekannt vor? Genau das hatten wir vorhin schon beim Lotto-Beispiel. Das Dreieck ist also keine reine Spielerei, sondern richtig praktisch, wenn man schnell einen Binomialkoeffizienten braucht, ohne den Taschenrechner rauszuholen. Max erklärt jetzt die Laplace-Wahrscheinlichkeit.</w:t>
       </w:r>
     </w:p>
     <w:p>
@@ -909,7 +909,7 @@
           <w:color w:val="1E3A8A"/>
           <w:sz w:val="32"/>
         </w:rPr>
-        <w:t>Folie 8 – Laplace-Wahrscheinlichkeit (Person A)</w:t>
+        <w:t>Folie 8 – Laplace-Wahrscheinlichkeit (Max Manahl)</w:t>
       </w:r>
     </w:p>
     <w:p>
@@ -935,14 +935,14 @@
           <w:color w:val="1E3A8A"/>
           <w:sz w:val="23"/>
         </w:rPr>
-        <w:t xml:space="preserve">Person A: </w:t>
+        <w:t xml:space="preserve">Max: </w:t>
       </w:r>
       <w:r>
         <w:rPr>
           <w:color w:val="0F172A"/>
           <w:sz w:val="23"/>
         </w:rPr>
-        <w:t>Bis jetzt haben wir nur gezählt – jetzt verbinden wir das mit Wahrscheinlichkeit. Die Laplace-Formel ist denkbar einfach: P von A gleich Betrag A durch Betrag Omega.</w:t>
+        <w:t>Bis jetzt haben wir nur gezählt – jetzt machen wir daraus Wahrscheinlichkeit. Die Laplace-Formel ist eigentlich ziemlich simpel: P von A gleich Betrag A durch Betrag Omega.</w:t>
       </w:r>
     </w:p>
     <w:p>
@@ -955,14 +955,14 @@
           <w:color w:val="1E3A8A"/>
           <w:sz w:val="23"/>
         </w:rPr>
-        <w:t xml:space="preserve">Person A: </w:t>
+        <w:t xml:space="preserve">Max: </w:t>
       </w:r>
       <w:r>
         <w:rPr>
           <w:color w:val="0F172A"/>
           <w:sz w:val="23"/>
         </w:rPr>
-        <w:t>Betrag A sind die günstigen Fälle – also alle Ergebnisse, die unser gewünschtes Ereignis A erfüllen. Betrag Omega ist die Anzahl aller möglichen Ergebnisse, der komplette Ergebnisraum.</w:t>
+        <w:t>Betrag A sind die günstigen Fälle, also die Ergebnisse, die unser Ereignis A erfüllen. Betrag Omega ist einfach alles, was überhaupt passieren kann, der ganze Ergebnisraum.</w:t>
       </w:r>
     </w:p>
     <w:p>
@@ -975,14 +975,14 @@
           <w:color w:val="1E3A8A"/>
           <w:sz w:val="23"/>
         </w:rPr>
-        <w:t xml:space="preserve">Person A: </w:t>
+        <w:t xml:space="preserve">Max: </w:t>
       </w:r>
       <w:r>
         <w:rPr>
           <w:color w:val="0F172A"/>
           <w:sz w:val="23"/>
         </w:rPr>
-        <w:t>Ganz wichtig dabei: Diese Formel funktioniert nur, wenn alle Ergebnisse gleich wahrscheinlich sind – das nennt man ein Laplace-Experiment. Bei einem fairen Würfel ist das der Fall, bei einem gezinkten Würfel nicht mehr!</w:t>
+        <w:t>Wichtig dabei: Das funktioniert nur, wenn alle Ergebnisse gleich wahrscheinlich sind – das nennt man ein Laplace-Experiment. Bei einem fairen Würfel passt das, bei einem gezinkten nicht mehr.</w:t>
       </w:r>
     </w:p>
     <w:p>
@@ -995,14 +995,14 @@
           <w:color w:val="1E3A8A"/>
           <w:sz w:val="23"/>
         </w:rPr>
-        <w:t xml:space="preserve">Person A: </w:t>
+        <w:t xml:space="preserve">Max: </w:t>
       </w:r>
       <w:r>
         <w:rPr>
           <w:color w:val="0F172A"/>
           <w:sz w:val="23"/>
         </w:rPr>
-        <w:t>Schauen wir uns das am Würfeln an: Wir werfen zwei Würfel und fragen uns, wie wahrscheinlich ein Pasch ist – also dass beide Würfel die gleiche Zahl zeigen. Mit dem Zählprinzip von ganz am Anfang wissen wir: Es gibt 6 mal 6, also 36 mögliche Ergebnisse – das ist unser Omega. Schaut euch die Diagonale im Raster an: Das sind genau die 6 Fälle, in denen beide Würfel gleich sind – das ist unser A. Also P von Pasch gleich 6 durch 36, gleich 1 durch 6.</w:t>
+        <w:t>Schauen wir uns das beim Würfeln an: Wir werfen zwei Würfel, wie wahrscheinlich ist ein Pasch, also beide zeigen die gleiche Zahl? Mit dem Zählprinzip von ganz am Anfang wissen wir schon: 6 mal 6, also 36 mögliche Ergebnisse, das ist unser Omega. Und die Diagonale im Raster, das sind die 6 Fälle, wo beide gleich sind – unser A. Also P von Pasch gleich 6 durch 36, gleich 1 durch 6.</w:t>
       </w:r>
     </w:p>
     <w:p>
@@ -1015,14 +1015,14 @@
           <w:color w:val="1E3A8A"/>
           <w:sz w:val="23"/>
         </w:rPr>
-        <w:t xml:space="preserve">Person A: </w:t>
+        <w:t xml:space="preserve">Max: </w:t>
       </w:r>
       <w:r>
         <w:rPr>
           <w:color w:val="0F172A"/>
           <w:sz w:val="23"/>
         </w:rPr>
-        <w:t>Das zeigt schön: Kombinatorik und Wahrscheinlichkeit hängen direkt zusammen – ohne richtig zu zählen, kann man gar keine Wahrscheinlichkeit berechnen. Weiter zu [Name B] und unserer Lotto-Frage.</w:t>
+        <w:t>Man sieht schön: Ohne richtig zu zählen, kommt man bei der Wahrscheinlichkeit nirgends hin. Simon zeigt euch jetzt, was das fürs Lotto bedeutet.</w:t>
       </w:r>
     </w:p>
     <w:p>
@@ -1043,7 +1043,7 @@
           <w:color w:val="1E3A8A"/>
           <w:sz w:val="32"/>
         </w:rPr>
-        <w:t>Folie 9 – Lotto 6 aus 45 (Person B)</w:t>
+        <w:t>Folie 9 – Lotto 6 aus 45 (Simon Schick)</w:t>
       </w:r>
     </w:p>
     <w:p>
@@ -1069,14 +1069,14 @@
           <w:color w:val="EA580C"/>
           <w:sz w:val="23"/>
         </w:rPr>
-        <w:t xml:space="preserve">Person B: </w:t>
+        <w:t xml:space="preserve">Simon: </w:t>
       </w:r>
       <w:r>
         <w:rPr>
           <w:color w:val="0F172A"/>
           <w:sz w:val="23"/>
         </w:rPr>
-        <w:t>Jetzt lösen wir die dritte und letzte Frage von ganz am Anfang auf: Wie wahrscheinlich ist ein Sechser beim Lotto 6 aus 45?</w:t>
+        <w:t>Jetzt lösen wir die letzte Frage von ganz am Anfang auf: Wie wahrscheinlich ist ein Sechser beim Lotto 6 aus 45?</w:t>
       </w:r>
     </w:p>
     <w:p>
@@ -1089,14 +1089,14 @@
           <w:color w:val="EA580C"/>
           <w:sz w:val="23"/>
         </w:rPr>
-        <w:t xml:space="preserve">Person B: </w:t>
+        <w:t xml:space="preserve">Simon: </w:t>
       </w:r>
       <w:r>
         <w:rPr>
           <w:color w:val="0F172A"/>
           <w:sz w:val="23"/>
         </w:rPr>
-        <w:t>Zuerst brauchen wir Omega – alle möglichen Tipps. Wir wählen 6 Zahlen aus 45, Reihenfolge ist egal, also eine Kombination ohne Wiederholung: 45 über 6. Das ergibt die unglaubliche Zahl von 8.145.060 möglichen Tipps.</w:t>
+        <w:t>Zuerst Omega, also alle möglichen Tipps. Wir wählen 6 Zahlen aus 45, Reihenfolge egal, also eine Kombination ohne Wiederholung: 45 über 6. Kommt da eine wahnsinnige Zahl raus – 8.145.060 mögliche Tipps.</w:t>
       </w:r>
     </w:p>
     <w:p>
@@ -1109,14 +1109,14 @@
           <w:color w:val="EA580C"/>
           <w:sz w:val="23"/>
         </w:rPr>
-        <w:t xml:space="preserve">Person B: </w:t>
+        <w:t xml:space="preserve">Simon: </w:t>
       </w:r>
       <w:r>
         <w:rPr>
           <w:color w:val="0F172A"/>
           <w:sz w:val="23"/>
         </w:rPr>
-        <w:t>Und A – die für uns günstigen Fälle? Das ist genau 1: nur der eine Tipp, der tatsächlich gezogen wird. Damit ergibt sich P von 6 Richtige gleich 1 durch 8.145.060 – das sind ungefähr 0,0000123 Prozent.</w:t>
+        <w:t>Und A, die günstigen Fälle? Genau 1 – nur der eine Tipp, der wirklich gezogen wird. Damit ist P von 6 Richtige gleich 1 durch 8.145.060, also ungefähr 0,0000123 Prozent.</w:t>
       </w:r>
     </w:p>
     <w:p>
@@ -1129,14 +1129,14 @@
           <w:color w:val="EA580C"/>
           <w:sz w:val="23"/>
         </w:rPr>
-        <w:t xml:space="preserve">Person B: </w:t>
+        <w:t xml:space="preserve">Simon: </w:t>
       </w:r>
       <w:r>
         <w:rPr>
           <w:color w:val="0F172A"/>
           <w:sz w:val="23"/>
         </w:rPr>
-        <w:t>Um sich das vorstellen zu können: Das ist ungefähr so wahrscheinlich, wie wenn man unter allen 9 Millionen Einwohnerinnen und Einwohnern Österreichs zufällig genau eine ganz bestimmte Person herauspickt. Jetzt haben wir alle drei Einstiegsfragen beantwortet – Zeit für den praktischen Teil! Übergabe an [Name C].</w:t>
+        <w:t>Damit ihr ein Gefühl dafür kriegt: Das ist ungefähr so wahrscheinlich, wie wenn man unter allen 9 Millionen Leuten in Österreich zufällig genau eine bestimmte Person herauspickt. Damit sind alle drei Fragen von vorhin geklärt – Zeit für den praktischen Teil, den übernimmt jetzt Daniel.</w:t>
       </w:r>
     </w:p>
     <w:p>
@@ -1157,7 +1157,7 @@
           <w:color w:val="1E3A8A"/>
           <w:sz w:val="32"/>
         </w:rPr>
-        <w:t>Folie 10 – Praktischer Teil: Estimation-Spiel (Person C)</w:t>
+        <w:t>Folie 10 – Praktischer Teil: Estimation-Spiel (Daniel Kornfeld)</w:t>
       </w:r>
     </w:p>
     <w:p>
@@ -1183,14 +1183,14 @@
           <w:color w:val="2563EB"/>
           <w:sz w:val="23"/>
         </w:rPr>
-        <w:t xml:space="preserve">Person C: </w:t>
+        <w:t xml:space="preserve">Daniel: </w:t>
       </w:r>
       <w:r>
         <w:rPr>
           <w:color w:val="0F172A"/>
           <w:sz w:val="23"/>
         </w:rPr>
-        <w:t>Jetzt seid ihr dran! Wir machen ein kleines Schätzspiel mit zwei Runden.</w:t>
+        <w:t>Jetzt seid ihr dran. Wir spielen ein kleines Schätzspiel, zwei Runden.</w:t>
       </w:r>
     </w:p>
     <w:p>
@@ -1203,14 +1203,14 @@
           <w:color w:val="2563EB"/>
           <w:sz w:val="23"/>
         </w:rPr>
-        <w:t xml:space="preserve">Person C: </w:t>
+        <w:t xml:space="preserve">Daniel: </w:t>
       </w:r>
       <w:r>
         <w:rPr>
           <w:color w:val="0F172A"/>
           <w:sz w:val="23"/>
         </w:rPr>
-        <w:t>So funktioniert's: Wir stellen euch jeweils eine überraschende Frage. Jede Person schätzt für sich selbst, still im Kopf oder auf einem Zettel – bitte keinen Taschenrechner und kein Absprechen mit dem Sitznachbarn! Dann rechnen wir gemeinsam die richtige Antwort aus, und ihr seht, wie nahe ihr dran wart.</w:t>
+        <w:t>So geht's: Wir stellen euch eine überraschende Frage, jeder schätzt für sich, im Kopf oder auf einem Zettel – bitte kein Taschenrechner, kein Absprechen mit dem Sitznachbarn. Dann rechnen wir gemeinsam aus, was wirklich rauskommt, und ihr seht, wie nah ihr dran wart.</w:t>
       </w:r>
     </w:p>
     <w:p>
@@ -1223,14 +1223,14 @@
           <w:color w:val="2563EB"/>
           <w:sz w:val="23"/>
         </w:rPr>
-        <w:t xml:space="preserve">Person C: </w:t>
+        <w:t xml:space="preserve">Daniel: </w:t>
       </w:r>
       <w:r>
         <w:rPr>
           <w:color w:val="0F172A"/>
           <w:sz w:val="23"/>
         </w:rPr>
-        <w:t>Zwei Runden – seid ihr bereit?</w:t>
+        <w:t>Bereit für Runde 1?</w:t>
       </w:r>
     </w:p>
     <w:p>
@@ -1251,7 +1251,7 @@
           <w:color w:val="1E3A8A"/>
           <w:sz w:val="32"/>
         </w:rPr>
-        <w:t>Folie 11 – Runde 1: Eure Schätzung (Person A)</w:t>
+        <w:t>Folie 11 – Runde 1: Eure Schätzung (Max Manahl)</w:t>
       </w:r>
     </w:p>
     <w:p>
@@ -1277,14 +1277,14 @@
           <w:color w:val="1E3A8A"/>
           <w:sz w:val="23"/>
         </w:rPr>
-        <w:t xml:space="preserve">Person A: </w:t>
+        <w:t xml:space="preserve">Max: </w:t>
       </w:r>
       <w:r>
         <w:rPr>
           <w:color w:val="0F172A"/>
           <w:sz w:val="23"/>
         </w:rPr>
-        <w:t>Hier die erste Frage: Stellt euch vor, ihr alle verlasst nacheinander, einer nach dem anderen, das Klassenzimmer. Wie viele verschiedene Reihenfolgen gibt es dafür – für euch 15 Schüler:innen?</w:t>
+        <w:t>Hier die erste Frage: Stellt euch vor, ihr verlasst alle nacheinander das Klassenzimmer, einer nach dem anderen. Wie viele verschiedene Reihenfolgen gibt es da – für euch 15 Schüler:innen?</w:t>
       </w:r>
     </w:p>
     <w:p>
@@ -1310,14 +1310,14 @@
           <w:color w:val="1E3A8A"/>
           <w:sz w:val="23"/>
         </w:rPr>
-        <w:t xml:space="preserve">Person A: </w:t>
+        <w:t xml:space="preserve">Max: </w:t>
       </w:r>
       <w:r>
         <w:rPr>
           <w:color w:val="0F172A"/>
           <w:sz w:val="23"/>
         </w:rPr>
-        <w:t>Schreibt eure Schätzung auf oder merkt sie euch gut – wir vergleichen gleich!</w:t>
+        <w:t>Schreibt's auf oder merkt's euch gut, wir vergleichen gleich.</w:t>
       </w:r>
     </w:p>
     <w:p>
@@ -1343,14 +1343,14 @@
           <w:color w:val="1E3A8A"/>
           <w:sz w:val="23"/>
         </w:rPr>
-        <w:t xml:space="preserve">Person A: </w:t>
+        <w:t xml:space="preserve">Max: </w:t>
       </w:r>
       <w:r>
         <w:rPr>
           <w:color w:val="0F172A"/>
           <w:sz w:val="23"/>
         </w:rPr>
-        <w:t>Übergabe an [Name B] für die Auflösung.</w:t>
+        <w:t>Simon löst auf.</w:t>
       </w:r>
     </w:p>
     <w:p>
@@ -1371,7 +1371,7 @@
           <w:color w:val="1E3A8A"/>
           <w:sz w:val="32"/>
         </w:rPr>
-        <w:t>Folie 12 – Runde 1: Auflösung (Person B)</w:t>
+        <w:t>Folie 12 – Runde 1: Auflösung (Simon Schick)</w:t>
       </w:r>
     </w:p>
     <w:p>
@@ -1397,14 +1397,14 @@
           <w:color w:val="EA580C"/>
           <w:sz w:val="23"/>
         </w:rPr>
-        <w:t xml:space="preserve">Person B: </w:t>
+        <w:t xml:space="preserve">Simon: </w:t>
       </w:r>
       <w:r>
         <w:rPr>
           <w:color w:val="0F172A"/>
           <w:sz w:val="23"/>
         </w:rPr>
-        <w:t>Das hier ist genau die Permutation von 15 Personen – P(15) gleich 15 Fakultät. Und 15 Fakultät ist...</w:t>
+        <w:t>Das ist genau die Permutation von 15 Personen, P(15) gleich 15 Fakultät. Und 15 Fakultät ist...</w:t>
       </w:r>
     </w:p>
     <w:p>
@@ -1430,14 +1430,14 @@
           <w:color w:val="EA580C"/>
           <w:sz w:val="23"/>
         </w:rPr>
-        <w:t xml:space="preserve">Person B: </w:t>
+        <w:t xml:space="preserve">Simon: </w:t>
       </w:r>
       <w:r>
         <w:rPr>
           <w:color w:val="0F172A"/>
           <w:sz w:val="23"/>
         </w:rPr>
-        <w:t>...1.307.674.368.000. Über 1,3 Billionen! Damit das greifbar wird: Stellt euch vor, ihr probiert ab jetzt eine Reihenfolge pro Sekunde durch, ohne Pause. Wie lange würdet ihr brauchen, um wirklich alle durchzuprobieren? Die Antwort: ungefähr 41.466 Jahre. Wenn man heute damit anfangen würde, hätte man um ca. 39.000 vor Christus begonnen – das ist die Steinzeit, also bevor es überhaupt Schrift, Landwirtschaft oder sesshafte Siedlungen gab!</w:t>
+        <w:t>...1.307.674.368.000. Über 1,3 Billionen. Damit ihr ein Gefühl dafür kriegt: Stellt euch vor, ihr probiert ab jetzt eine Reihenfolge pro Sekunde durch, ohne Pause. Wie lange würde das dauern, bis wirklich alle durch sind? Ungefähr 41.466 Jahre. Hätte man damit heute angefangen, wäre man bei ca. 39.000 vor Christus gestartet – das ist die Steinzeit, da gab's noch nicht mal Schrift oder Landwirtschaft.</w:t>
       </w:r>
     </w:p>
     <w:p>
@@ -1450,14 +1450,14 @@
           <w:color w:val="EA580C"/>
           <w:sz w:val="23"/>
         </w:rPr>
-        <w:t xml:space="preserve">Person B: </w:t>
+        <w:t xml:space="preserve">Simon: </w:t>
       </w:r>
       <w:r>
         <w:rPr>
           <w:color w:val="0F172A"/>
           <w:sz w:val="23"/>
         </w:rPr>
-        <w:t>Das zeigt: 15 Fakultät heißt 15 mal 14 mal 13 und so weiter bis 1 – die Fakultät wächst astronomisch schnell. Schon bei nur 15 Elementen übersteigt das Ergebnis 1,3 Billionen. Übergabe an [Name C] für Runde 2.</w:t>
+        <w:t>15 Fakultät heißt einfach 15 mal 14 mal 13 und so weiter bis runter auf 1 – und schon bei nur 15 Elementen kommt da diese Wahnsinnszahl raus. Daniel macht weiter mit Runde 2.</w:t>
       </w:r>
     </w:p>
     <w:p>
@@ -1478,7 +1478,7 @@
           <w:color w:val="1E3A8A"/>
           <w:sz w:val="32"/>
         </w:rPr>
-        <w:t>Folie 13 – Runde 2: Eure Schätzung (Person C)</w:t>
+        <w:t>Folie 13 – Runde 2: Eure Schätzung (Daniel Kornfeld)</w:t>
       </w:r>
     </w:p>
     <w:p>
@@ -1504,14 +1504,14 @@
           <w:color w:val="2563EB"/>
           <w:sz w:val="23"/>
         </w:rPr>
-        <w:t xml:space="preserve">Person C: </w:t>
+        <w:t xml:space="preserve">Daniel: </w:t>
       </w:r>
       <w:r>
         <w:rPr>
           <w:color w:val="0F172A"/>
           <w:sz w:val="23"/>
         </w:rPr>
-        <w:t>Runde 2, und jetzt wird's richtig groß: Wie viele verschiedene Möglichkeiten gibt es, ein Standard-Kartenspiel mit 52 Karten zu mischen?</w:t>
+        <w:t>Runde 2, und jetzt wird's richtig groß: Wie viele Möglichkeiten gibt's, ein Kartenspiel mit 52 Karten zu mischen?</w:t>
       </w:r>
     </w:p>
     <w:p>
@@ -1524,14 +1524,14 @@
           <w:color w:val="2563EB"/>
           <w:sz w:val="23"/>
         </w:rPr>
-        <w:t xml:space="preserve">Person C: </w:t>
+        <w:t xml:space="preserve">Daniel: </w:t>
       </w:r>
       <w:r>
         <w:rPr>
           <w:color w:val="0F172A"/>
           <w:sz w:val="23"/>
         </w:rPr>
-        <w:t>Kleiner Tipp dazu: Das ist eine Permutation von 52 Elementen, also P(52) gleich 52 Fakultät.</w:t>
+        <w:t>Kleiner Tipp: Das ist eine Permutation von 52 Elementen, also P(52) gleich 52 Fakultät.</w:t>
       </w:r>
     </w:p>
     <w:p>
@@ -1570,14 +1570,14 @@
           <w:color w:val="2563EB"/>
           <w:sz w:val="23"/>
         </w:rPr>
-        <w:t xml:space="preserve">Person C: </w:t>
+        <w:t xml:space="preserve">Daniel: </w:t>
       </w:r>
       <w:r>
         <w:rPr>
           <w:color w:val="0F172A"/>
           <w:sz w:val="23"/>
         </w:rPr>
-        <w:t>Übergabe an [Name A] für die Auflösung.</w:t>
+        <w:t>Max löst auf.</w:t>
       </w:r>
     </w:p>
     <w:p>
@@ -1598,7 +1598,7 @@
           <w:color w:val="1E3A8A"/>
           <w:sz w:val="32"/>
         </w:rPr>
-        <w:t>Folie 14 – Runde 2: Auflösung (Person A)</w:t>
+        <w:t>Folie 14 – Runde 2: Auflösung (Max Manahl)</w:t>
       </w:r>
     </w:p>
     <w:p>
@@ -1624,14 +1624,14 @@
           <w:color w:val="1E3A8A"/>
           <w:sz w:val="23"/>
         </w:rPr>
-        <w:t xml:space="preserve">Person A: </w:t>
+        <w:t xml:space="preserve">Max: </w:t>
       </w:r>
       <w:r>
         <w:rPr>
           <w:color w:val="0F172A"/>
           <w:sz w:val="23"/>
         </w:rPr>
-        <w:t>52 Fakultät ist ungefähr 8,07 mal 10 hoch 67 – eine Zahl mit 68 Stellen!</w:t>
+        <w:t>52 Fakultät ist ungefähr 8,07 mal 10 hoch 67 – eine Zahl mit 68 Stellen.</w:t>
       </w:r>
     </w:p>
     <w:p>
@@ -1644,14 +1644,14 @@
           <w:color w:val="1E3A8A"/>
           <w:sz w:val="23"/>
         </w:rPr>
-        <w:t xml:space="preserve">Person A: </w:t>
+        <w:t xml:space="preserve">Max: </w:t>
       </w:r>
       <w:r>
         <w:rPr>
           <w:color w:val="0F172A"/>
           <w:sz w:val="23"/>
         </w:rPr>
-        <w:t>Damit ihr eine Vorstellung davon kriegt, wie riesig das ist: Das gesamte sichtbare Universum hat schätzungsweise 10 hoch 80 Atome. 52 Fakultät ist zwar immer noch kleiner als das – aber stellt euch vor: Wenn seit dem Urknall JEDES einzelne Atom im Universum JEDE Sekunde eine komplett neue Reihenfolge bilden würde, gäbe es bis heute trotzdem kaum Wiederholungen.</w:t>
+        <w:t>Damit ihr eine Vorstellung davon kriegt, wie groß das ist: Das sichtbare Universum hat ungefähr 10 hoch 80 Atome. 52 Fakultät ist zwar noch kleiner als das, aber stellt euch vor: Würde seit dem Urknall jedes einzelne Atom im Universum jede Sekunde eine komplett neue Reihenfolge bilden, gäbe es bis heute trotzdem kaum Wiederholungen.</w:t>
       </w:r>
     </w:p>
     <w:p>
@@ -1664,14 +1664,14 @@
           <w:color w:val="1E3A8A"/>
           <w:sz w:val="23"/>
         </w:rPr>
-        <w:t xml:space="preserve">Person A: </w:t>
+        <w:t xml:space="preserve">Max: </w:t>
       </w:r>
       <w:r>
         <w:rPr>
           <w:color w:val="0F172A"/>
           <w:sz w:val="23"/>
         </w:rPr>
-        <w:t>Die Schlussfolgerung daraus: Fast jede Kartenmischung, die du jemals in deinem Leben machst, ist mit an Sicherheit grenzender Wahrscheinlichkeit einzigartig in der gesamten Menschheitsgeschichte – noch nie zuvor in genau dieser Reihenfolge gemischt worden, und wird es wahrscheinlich auch nie wieder. Übergabe an [Name B] für die Zusammenfassung.</w:t>
+        <w:t>Heißt im Endeffekt: Fast jedes Mal, wenn du Karten mischst, ist das mit ziemlicher Sicherheit eine Reihenfolge, die es in der ganzen Menschheitsgeschichte noch nie gab – und wahrscheinlich auch nie wieder geben wird. Simon fasst jetzt alles zusammen.</w:t>
       </w:r>
     </w:p>
     <w:p>
@@ -1692,7 +1692,7 @@
           <w:color w:val="1E3A8A"/>
           <w:sz w:val="32"/>
         </w:rPr>
-        <w:t>Folie 15 – Übersichtstabelle (Person B)</w:t>
+        <w:t>Folie 15 – Übersichtstabelle (Simon Schick)</w:t>
       </w:r>
     </w:p>
     <w:p>
@@ -1718,14 +1718,14 @@
           <w:color w:val="EA580C"/>
           <w:sz w:val="23"/>
         </w:rPr>
-        <w:t xml:space="preserve">Person B: </w:t>
+        <w:t xml:space="preserve">Simon: </w:t>
       </w:r>
       <w:r>
         <w:rPr>
           <w:color w:val="0F172A"/>
           <w:sz w:val="23"/>
         </w:rPr>
-        <w:t>Bevor wir zusammenfassen, hier noch die kompakte Übersicht über alles, was wir heute besprochen haben.</w:t>
+        <w:t>Bevor wir zusammenfassen, hier noch mal die kompakte Übersicht über alles, was wir heute besprochen haben.</w:t>
       </w:r>
     </w:p>
     <w:p>
@@ -1738,14 +1738,14 @@
           <w:color w:val="EA580C"/>
           <w:sz w:val="23"/>
         </w:rPr>
-        <w:t xml:space="preserve">Person B: </w:t>
+        <w:t xml:space="preserve">Simon: </w:t>
       </w:r>
       <w:r>
         <w:rPr>
           <w:color w:val="0F172A"/>
           <w:sz w:val="23"/>
         </w:rPr>
-        <w:t>Der Trick, um in der Matura schnell die richtige Formel zu finden, sind eigentlich nur zwei Fragen: Erstens – ist die Reihenfolge wichtig? Wenn ja, sind wir bei Variation oder Permutation, wenn alle Elemente verwendet werden. Wenn die Reihenfolge egal ist, sind wir bei Kombination.</w:t>
+        <w:t>Der Trick, um in der Matura schnell auf die richtige Formel zu kommen, sind eigentlich nur zwei Fragen. Erstens: Ist die Reihenfolge wichtig? Wenn ja, sind wir bei Variation, oder bei Permutation, wenn alle Elemente verwendet werden. Wenn die Reihenfolge egal ist, sind wir bei Kombination.</w:t>
       </w:r>
     </w:p>
     <w:p>
@@ -1758,14 +1758,14 @@
           <w:color w:val="EA580C"/>
           <w:sz w:val="23"/>
         </w:rPr>
-        <w:t xml:space="preserve">Person B: </w:t>
+        <w:t xml:space="preserve">Simon: </w:t>
       </w:r>
       <w:r>
         <w:rPr>
           <w:color w:val="0F172A"/>
           <w:sz w:val="23"/>
         </w:rPr>
-        <w:t>Zweitens – wird mit oder ohne Wiederholung gewählt, also mit oder ohne Zurücklegen? Das entscheidet, welche der beiden Formel-Varianten man nimmt.</w:t>
+        <w:t>Und zweitens: Wird mit oder ohne Wiederholung gewählt, also mit oder ohne Zurücklegen? Das entscheidet dann, welche der beiden Formeln man genau nimmt.</w:t>
       </w:r>
     </w:p>
     <w:p>
@@ -1778,14 +1778,14 @@
           <w:color w:val="EA580C"/>
           <w:sz w:val="23"/>
         </w:rPr>
-        <w:t xml:space="preserve">Person B: </w:t>
+        <w:t xml:space="preserve">Simon: </w:t>
       </w:r>
       <w:r>
         <w:rPr>
           <w:color w:val="0F172A"/>
           <w:sz w:val="23"/>
         </w:rPr>
-        <w:t>Mit diesen zwei Fragen kommt man bei jeder Kombinatorik-Aufgabe in der Matura zur richtigen Formel. Übergabe an alle drei für die Zusammenfassung.</w:t>
+        <w:t>Mit diesen zwei Fragen kommt man bei jeder Kombinatorik-Aufgabe in der Matura zur richtigen Formel.</w:t>
       </w:r>
     </w:p>
     <w:p>
@@ -1806,7 +1806,7 @@
           <w:color w:val="1E3A8A"/>
           <w:sz w:val="32"/>
         </w:rPr>
-        <w:t>Folie 16 – Zusammenfassung (Person Alle)</w:t>
+        <w:t>Folie 16 – Zusammenfassung (Alle)</w:t>
       </w:r>
     </w:p>
     <w:p>
@@ -1832,14 +1832,14 @@
           <w:color w:val="1E3A8A"/>
           <w:sz w:val="23"/>
         </w:rPr>
-        <w:t xml:space="preserve">Person A: </w:t>
+        <w:t xml:space="preserve">Max: </w:t>
       </w:r>
       <w:r>
         <w:rPr>
           <w:color w:val="0F172A"/>
           <w:sz w:val="23"/>
         </w:rPr>
-        <w:t>Mein wichtigster Punkt für heute: Das Zählprinzip ist die Basis von allem. Bei unabhängigen Schritten einfach die Möglichkeiten pro Schritt multiplizieren – daraus folgt am Ende alles andere.</w:t>
+        <w:t>Mein wichtigster Punkt für heute: Das Zählprinzip ist die Basis von allem. Bei unabhängigen Schritten einfach die Möglichkeiten pro Schritt multiplizieren – der Rest folgt eigentlich daraus.</w:t>
       </w:r>
     </w:p>
     <w:p>
@@ -1852,14 +1852,14 @@
           <w:color w:val="EA580C"/>
           <w:sz w:val="23"/>
         </w:rPr>
-        <w:t xml:space="preserve">Person B: </w:t>
+        <w:t xml:space="preserve">Simon: </w:t>
       </w:r>
       <w:r>
         <w:rPr>
           <w:color w:val="0F172A"/>
           <w:sz w:val="23"/>
         </w:rPr>
-        <w:t>Für mich: Zwei Fragen führen euch zur richtigen Formel – Ist die Reihenfolge wichtig? Und: Wird mit Wiederholung gewählt? Wenn ihr diese zwei Fragen stellt, findet ihr in der Matura immer die passende Formel.</w:t>
+        <w:t>Für mich: Zwei Fragen bringen euch zur richtigen Formel. Ist die Reihenfolge wichtig? Und wird mit Wiederholung gewählt? Wenn ihr die zwei Fragen stellt, findet ihr in der Matura immer die passende Formel.</w:t>
       </w:r>
     </w:p>
     <w:p>
@@ -1872,14 +1872,14 @@
           <w:color w:val="2563EB"/>
           <w:sz w:val="23"/>
         </w:rPr>
-        <w:t xml:space="preserve">Person C: </w:t>
+        <w:t xml:space="preserve">Daniel: </w:t>
       </w:r>
       <w:r>
         <w:rPr>
           <w:color w:val="0F172A"/>
           <w:sz w:val="23"/>
         </w:rPr>
-        <w:t>Und von mir: Mit Laplace, P von A gleich Betrag A durch Betrag Omega, werden aus abstrakten Kombinatorik-Formeln ganz konkrete Wahrscheinlichkeiten – egal ob beim Würfeln, beim Lotto, oder beim Kartenmischen.</w:t>
+        <w:t>Und von mir: Mit Laplace, P von A gleich Betrag A durch Betrag Omega, werden aus abstrakten Kombinatorik-Formeln plötzlich ganz konkrete Wahrscheinlichkeiten – beim Würfeln, beim Lotto, oder beim Kartenmischen.</w:t>
       </w:r>
     </w:p>
     <w:p>
@@ -1900,7 +1900,7 @@
           <w:color w:val="1E3A8A"/>
           <w:sz w:val="32"/>
         </w:rPr>
-        <w:t>Folie 17 – Quellen (Person Alle)</w:t>
+        <w:t>Folie 17 – Quellen (Alle)</w:t>
       </w:r>
     </w:p>
     <w:p>
@@ -1926,14 +1926,14 @@
           <w:color w:val="1E3A8A"/>
           <w:sz w:val="23"/>
         </w:rPr>
-        <w:t xml:space="preserve">Person A: </w:t>
+        <w:t xml:space="preserve">Max: </w:t>
       </w:r>
       <w:r>
         <w:rPr>
           <w:color w:val="0F172A"/>
           <w:sz w:val="23"/>
         </w:rPr>
-        <w:t>Hier kurz unsere Quellen – Lehrplan und Formelsammlung vom BMBWF, unser Schulbuch, mathe-online.at, die Österreichischen Lotterien für die Lotto-Daten, und Wikipedia für die Begriffsdefinitionen. Alle Diagramme und Grafiken haben wir selbst mit Python erstellt.</w:t>
+        <w:t>Hier noch kurz unsere Quellen: Lehrplan und Formelsammlung vom BMBWF, unser Schulbuch, mathe-online.at, die Österreichischen Lotterien für die Lotto-Zahlen, und Wikipedia für die Begriffe. Alle Grafiken haben wir selbst mit Python erstellt.</w:t>
       </w:r>
     </w:p>
     <w:p>
@@ -1954,7 +1954,7 @@
           <w:color w:val="1E3A8A"/>
           <w:sz w:val="32"/>
         </w:rPr>
-        <w:t>Folie 18 – Danke / Fragen (Person Alle)</w:t>
+        <w:t>Folie 18 – Danke / Fragen (Alle)</w:t>
       </w:r>
     </w:p>
     <w:p>
@@ -1980,14 +1980,14 @@
           <w:color w:val="1E3A8A"/>
           <w:sz w:val="23"/>
         </w:rPr>
-        <w:t xml:space="preserve">Person A: </w:t>
+        <w:t xml:space="preserve">Max: </w:t>
       </w:r>
       <w:r>
         <w:rPr>
           <w:color w:val="0F172A"/>
           <w:sz w:val="23"/>
         </w:rPr>
-        <w:t>Damit sind wir am Ende unserer Präsentation.</w:t>
+        <w:t>Damit wären wir fertig.</w:t>
       </w:r>
     </w:p>
     <w:p>
@@ -2000,7 +2000,7 @@
           <w:color w:val="EA580C"/>
           <w:sz w:val="23"/>
         </w:rPr>
-        <w:t xml:space="preserve">Person B: </w:t>
+        <w:t xml:space="preserve">Simon: </w:t>
       </w:r>
       <w:r>
         <w:rPr>
@@ -2020,14 +2020,14 @@
           <w:color w:val="2563EB"/>
           <w:sz w:val="23"/>
         </w:rPr>
-        <w:t xml:space="preserve">Person C: </w:t>
+        <w:t xml:space="preserve">Daniel: </w:t>
       </w:r>
       <w:r>
         <w:rPr>
           <w:color w:val="0F172A"/>
           <w:sz w:val="23"/>
         </w:rPr>
-        <w:t>Habt ihr noch Fragen? Oder – was war eure überraschendste Zahl heute?</w:t>
+        <w:t>Habt ihr noch Fragen? Oder sagt uns – was war eure überraschendste Zahl heute?</w:t>
       </w:r>
     </w:p>
     <w:p>
@@ -2059,7 +2059,7 @@
         <w:rPr>
           <w:sz w:val="22"/>
         </w:rPr>
-        <w:t>Reine Sprechzeit liegt bei ca. 20–21 Minuten. Mit den eingeplanten Pausen für das Schätzspiel (Runde 1 + Runde 2, je 30–60 Sek. Stille + kurze Handzeichen-Abfrage) und etwas Luft zum natürlichen Sprechen kommt ihr realistisch auf 22–25 Minuten – genau im Zielbereich.</w:t>
+        <w:t>Reine Sprechzeit liegt bei ca. 20-21 Minuten. Mit den Pausen fürs Schätzspiel (Runde 1 + Runde 2, je 30-60 Sek. Stille plus kurze Handzeichen-Abfrage) und etwas Luft zum normalen Reden kommt ihr realistisch auf 22-25 Minuten – genau im Zielbereich.</w:t>
       </w:r>
     </w:p>
     <w:p>
@@ -2074,7 +2074,7 @@
         <w:rPr>
           <w:sz w:val="22"/>
         </w:rPr>
-        <w:t>Übt die Übergaben zwischen den Personen extra – „Übergabe an [Name]“ sollte flüssig klingen, nicht abgelesen. Am besten merkt sich jede:r nur den letzten Satz der eigenen Folie und den ersten Satz der eigenen nächsten Folie auswendig, den Rest in eigenen Worten erzählen.</w:t>
+        <w:t>Lernt nicht den ganzen Text auswendig, sondern nur den letzten Satz der eigenen Folie und den ersten Satz der eigenen nächsten Folie – den Rest erzählt einfach mit eigenen Worten. Übergaben wie 'Simon löst auf' oder 'Daniel zeigt euch...' kurz und beiläufig sagen, nicht wie eine Ansage.</w:t>
       </w:r>
     </w:p>
     <w:sectPr>

</xml_diff>

<commit_message>
Strip stage directions and meta clutter from Sprechtext
Remove bracketed cues like [kurze Pause], timing estimates, and the
closing tips/duration section so the script is just plain spoken text
per slide.

Co-Authored-By: Claude Sonnet 4.6 <noreply@anthropic.com>
Claude-Session: https://claude.ai/code/session_011GCz4SkuA8z3fXejpj4Mgy
</commit_message>
<xml_diff>
--- a/kombinatorik-praesentation/sprechtext.docx
+++ b/kombinatorik-praesentation/sprechtext.docx
@@ -17,40 +17,6 @@
     </w:p>
     <w:p>
       <w:pPr>
-        <w:spacing w:after="160"/>
-      </w:pPr>
-      <w:r>
-        <w:rPr>
-          <w:i/>
-          <w:color w:val="64748B"/>
-          <w:sz w:val="21"/>
-        </w:rPr>
-        <w:t>Max Manahl (A) -&gt; Simon Schick (B) -&gt; Daniel Kornfeld (C), rotierend durch alle 18 Folien. Zieldauer: ca. 20-25 Minuten (Zeitangaben sind Richtwerte).</w:t>
-      </w:r>
-    </w:p>
-    <w:p>
-      <w:pPr>
-        <w:spacing w:after="280"/>
-      </w:pPr>
-      <w:r>
-        <w:rPr>
-          <w:i/>
-          <w:color w:val="64748B"/>
-          <w:sz w:val="21"/>
-        </w:rPr>
-        <w:t>Hinweis: Das hier ist eine Gedankenstütze, kein Text zum Ablesen. Lest es ein paar Mal durch und erzählt es dann mit euren eigenen Worten nach – das klingt automatisch lockerer und natürlicher, als wenn ihr es Wort für Wort vortragt.</w:t>
-      </w:r>
-    </w:p>
-    <w:p>
-      <w:pPr>
-        <w:spacing w:before="80" w:after="80"/>
-        <w:pBdr>
-          <w:bottom w:val="single" w:sz="6" w:space="1" w:color="C7D2E8"/>
-        </w:pBdr>
-      </w:pPr>
-    </w:p>
-    <w:p>
-      <w:pPr>
         <w:spacing w:before="280" w:after="120"/>
       </w:pPr>
       <w:r>
@@ -60,19 +26,6 @@
           <w:sz w:val="32"/>
         </w:rPr>
         <w:t>Folie 1 – Titelfolie (Alle)</w:t>
-      </w:r>
-    </w:p>
-    <w:p>
-      <w:pPr>
-        <w:spacing w:after="160"/>
-      </w:pPr>
-      <w:r>
-        <w:rPr>
-          <w:i/>
-          <w:color w:val="64748B"/>
-          <w:sz w:val="21"/>
-        </w:rPr>
-        <w:t>~30 Sek.</w:t>
       </w:r>
     </w:p>
     <w:p>
@@ -137,14 +90,6 @@
     </w:p>
     <w:p>
       <w:pPr>
-        <w:spacing w:before="80" w:after="80"/>
-        <w:pBdr>
-          <w:bottom w:val="single" w:sz="6" w:space="1" w:color="C7D2E8"/>
-        </w:pBdr>
-      </w:pPr>
-    </w:p>
-    <w:p>
-      <w:pPr>
         <w:spacing w:before="280" w:after="120"/>
       </w:pPr>
       <w:r>
@@ -154,19 +99,6 @@
           <w:sz w:val="32"/>
         </w:rPr>
         <w:t>Folie 2 – Agenda &amp; Einstiegsfragen (Max Manahl)</w:t>
-      </w:r>
-    </w:p>
-    <w:p>
-      <w:pPr>
-        <w:spacing w:after="160"/>
-      </w:pPr>
-      <w:r>
-        <w:rPr>
-          <w:i/>
-          <w:color w:val="64748B"/>
-          <w:sz w:val="21"/>
-        </w:rPr>
-        <w:t>~90 Sek.</w:t>
       </w:r>
     </w:p>
     <w:p>
@@ -226,86 +158,7 @@
           <w:color w:val="0F172A"/>
           <w:sz w:val="23"/>
         </w:rPr>
-        <w:t>Wie viele verschiedene 4-stellige PIN-Codes gibt's überhaupt?</w:t>
-      </w:r>
-    </w:p>
-    <w:p>
-      <w:pPr>
-        <w:spacing w:after="200"/>
-      </w:pPr>
-      <w:r>
-        <w:rPr>
-          <w:i/>
-          <w:color w:val="64748B"/>
-          <w:sz w:val="21"/>
-        </w:rPr>
-        <w:t>[kurze Pause]</w:t>
-      </w:r>
-    </w:p>
-    <w:p>
-      <w:pPr>
-        <w:spacing w:after="200" w:line="300" w:lineRule="auto"/>
-      </w:pPr>
-      <w:r>
-        <w:rPr>
-          <w:b/>
-          <w:color w:val="1E3A8A"/>
-          <w:sz w:val="23"/>
-        </w:rPr>
-        <w:t xml:space="preserve">Max: </w:t>
-      </w:r>
-      <w:r>
-        <w:rPr>
-          <w:color w:val="0F172A"/>
-          <w:sz w:val="23"/>
-        </w:rPr>
-        <w:t>Dann: Stellt euch vor, ihr alle hier in der Klasse tauscht gegenseitig eure Handynummern aus, jeder mit jedem einmal. Wie viele Austausche sind das am Ende insgesamt?</w:t>
-      </w:r>
-    </w:p>
-    <w:p>
-      <w:pPr>
-        <w:spacing w:after="200"/>
-      </w:pPr>
-      <w:r>
-        <w:rPr>
-          <w:i/>
-          <w:color w:val="64748B"/>
-          <w:sz w:val="21"/>
-        </w:rPr>
-        <w:t>[kurze Pause]</w:t>
-      </w:r>
-    </w:p>
-    <w:p>
-      <w:pPr>
-        <w:spacing w:after="200" w:line="300" w:lineRule="auto"/>
-      </w:pPr>
-      <w:r>
-        <w:rPr>
-          <w:b/>
-          <w:color w:val="1E3A8A"/>
-          <w:sz w:val="23"/>
-        </w:rPr>
-        <w:t xml:space="preserve">Max: </w:t>
-      </w:r>
-      <w:r>
-        <w:rPr>
-          <w:color w:val="0F172A"/>
-          <w:sz w:val="23"/>
-        </w:rPr>
-        <w:t>Und die letzte: Wie wahrscheinlich ist eigentlich ein Sechser beim Lotto 6 aus 45?</w:t>
-      </w:r>
-    </w:p>
-    <w:p>
-      <w:pPr>
-        <w:spacing w:after="200"/>
-      </w:pPr>
-      <w:r>
-        <w:rPr>
-          <w:i/>
-          <w:color w:val="64748B"/>
-          <w:sz w:val="21"/>
-        </w:rPr>
-        <w:t>[kurze Pause]</w:t>
+        <w:t>Wie viele verschiedene 4-stellige PIN-Codes gibt's überhaupt? Dann: Stellt euch vor, ihr alle hier in der Klasse tauscht gegenseitig eure Handynummern aus, jeder mit jedem einmal. Wie viele Austausche sind das am Ende insgesamt? Und die letzte: Wie wahrscheinlich ist eigentlich ein Sechser beim Lotto 6 aus 45?</w:t>
       </w:r>
     </w:p>
     <w:p>
@@ -330,14 +183,6 @@
     </w:p>
     <w:p>
       <w:pPr>
-        <w:spacing w:before="80" w:after="80"/>
-        <w:pBdr>
-          <w:bottom w:val="single" w:sz="6" w:space="1" w:color="C7D2E8"/>
-        </w:pBdr>
-      </w:pPr>
-    </w:p>
-    <w:p>
-      <w:pPr>
         <w:spacing w:before="280" w:after="120"/>
       </w:pPr>
       <w:r>
@@ -347,19 +192,6 @@
           <w:sz w:val="32"/>
         </w:rPr>
         <w:t>Folie 3 – Das Zählprinzip (Simon Schick)</w:t>
-      </w:r>
-    </w:p>
-    <w:p>
-      <w:pPr>
-        <w:spacing w:after="160"/>
-      </w:pPr>
-      <w:r>
-        <w:rPr>
-          <w:i/>
-          <w:color w:val="64748B"/>
-          <w:sz w:val="21"/>
-        </w:rPr>
-        <w:t>~80 Sek.</w:t>
       </w:r>
     </w:p>
     <w:p>
@@ -444,14 +276,6 @@
     </w:p>
     <w:p>
       <w:pPr>
-        <w:spacing w:before="80" w:after="80"/>
-        <w:pBdr>
-          <w:bottom w:val="single" w:sz="6" w:space="1" w:color="C7D2E8"/>
-        </w:pBdr>
-      </w:pPr>
-    </w:p>
-    <w:p>
-      <w:pPr>
         <w:spacing w:before="280" w:after="120"/>
       </w:pPr>
       <w:r>
@@ -461,19 +285,6 @@
           <w:sz w:val="32"/>
         </w:rPr>
         <w:t>Folie 4 – Permutation (Daniel Kornfeld)</w:t>
-      </w:r>
-    </w:p>
-    <w:p>
-      <w:pPr>
-        <w:spacing w:after="160"/>
-      </w:pPr>
-      <w:r>
-        <w:rPr>
-          <w:i/>
-          <w:color w:val="64748B"/>
-          <w:sz w:val="21"/>
-        </w:rPr>
-        <w:t>~100 Sek.</w:t>
       </w:r>
     </w:p>
     <w:p>
@@ -558,14 +369,6 @@
     </w:p>
     <w:p>
       <w:pPr>
-        <w:spacing w:before="80" w:after="80"/>
-        <w:pBdr>
-          <w:bottom w:val="single" w:sz="6" w:space="1" w:color="C7D2E8"/>
-        </w:pBdr>
-      </w:pPr>
-    </w:p>
-    <w:p>
-      <w:pPr>
         <w:spacing w:before="280" w:after="120"/>
       </w:pPr>
       <w:r>
@@ -575,19 +378,6 @@
           <w:sz w:val="32"/>
         </w:rPr>
         <w:t>Folie 5 – Variation (Max Manahl)</w:t>
-      </w:r>
-    </w:p>
-    <w:p>
-      <w:pPr>
-        <w:spacing w:after="160"/>
-      </w:pPr>
-      <w:r>
-        <w:rPr>
-          <w:i/>
-          <w:color w:val="64748B"/>
-          <w:sz w:val="21"/>
-        </w:rPr>
-        <w:t>~100 Sek.</w:t>
       </w:r>
     </w:p>
     <w:p>
@@ -672,14 +462,6 @@
     </w:p>
     <w:p>
       <w:pPr>
-        <w:spacing w:before="80" w:after="80"/>
-        <w:pBdr>
-          <w:bottom w:val="single" w:sz="6" w:space="1" w:color="C7D2E8"/>
-        </w:pBdr>
-      </w:pPr>
-    </w:p>
-    <w:p>
-      <w:pPr>
         <w:spacing w:before="280" w:after="120"/>
       </w:pPr>
       <w:r>
@@ -689,19 +471,6 @@
           <w:sz w:val="32"/>
         </w:rPr>
         <w:t>Folie 6 – Kombination (Simon Schick)</w:t>
-      </w:r>
-    </w:p>
-    <w:p>
-      <w:pPr>
-        <w:spacing w:after="160"/>
-      </w:pPr>
-      <w:r>
-        <w:rPr>
-          <w:i/>
-          <w:color w:val="64748B"/>
-          <w:sz w:val="21"/>
-        </w:rPr>
-        <w:t>~100 Sek.</w:t>
       </w:r>
     </w:p>
     <w:p>
@@ -746,19 +515,6 @@
     </w:p>
     <w:p>
       <w:pPr>
-        <w:spacing w:after="200"/>
-      </w:pPr>
-      <w:r>
-        <w:rPr>
-          <w:i/>
-          <w:color w:val="64748B"/>
-          <w:sz w:val="21"/>
-        </w:rPr>
-        <w:t>[kurze Pause]</w:t>
-      </w:r>
-    </w:p>
-    <w:p>
-      <w:pPr>
         <w:spacing w:after="200" w:line="300" w:lineRule="auto"/>
       </w:pPr>
       <w:r>
@@ -799,14 +555,6 @@
     </w:p>
     <w:p>
       <w:pPr>
-        <w:spacing w:before="80" w:after="80"/>
-        <w:pBdr>
-          <w:bottom w:val="single" w:sz="6" w:space="1" w:color="C7D2E8"/>
-        </w:pBdr>
-      </w:pPr>
-    </w:p>
-    <w:p>
-      <w:pPr>
         <w:spacing w:before="280" w:after="120"/>
       </w:pPr>
       <w:r>
@@ -816,19 +564,6 @@
           <w:sz w:val="32"/>
         </w:rPr>
         <w:t>Folie 7 – Pascal'sches Dreieck (Daniel Kornfeld)</w:t>
-      </w:r>
-    </w:p>
-    <w:p>
-      <w:pPr>
-        <w:spacing w:after="160"/>
-      </w:pPr>
-      <w:r>
-        <w:rPr>
-          <w:i/>
-          <w:color w:val="64748B"/>
-          <w:sz w:val="21"/>
-        </w:rPr>
-        <w:t>~70 Sek.</w:t>
       </w:r>
     </w:p>
     <w:p>
@@ -893,14 +628,6 @@
     </w:p>
     <w:p>
       <w:pPr>
-        <w:spacing w:before="80" w:after="80"/>
-        <w:pBdr>
-          <w:bottom w:val="single" w:sz="6" w:space="1" w:color="C7D2E8"/>
-        </w:pBdr>
-      </w:pPr>
-    </w:p>
-    <w:p>
-      <w:pPr>
         <w:spacing w:before="280" w:after="120"/>
       </w:pPr>
       <w:r>
@@ -910,19 +637,6 @@
           <w:sz w:val="32"/>
         </w:rPr>
         <w:t>Folie 8 – Laplace-Wahrscheinlichkeit (Max Manahl)</w:t>
-      </w:r>
-    </w:p>
-    <w:p>
-      <w:pPr>
-        <w:spacing w:after="160"/>
-      </w:pPr>
-      <w:r>
-        <w:rPr>
-          <w:i/>
-          <w:color w:val="64748B"/>
-          <w:sz w:val="21"/>
-        </w:rPr>
-        <w:t>~90 Sek.</w:t>
       </w:r>
     </w:p>
     <w:p>
@@ -1027,14 +741,6 @@
     </w:p>
     <w:p>
       <w:pPr>
-        <w:spacing w:before="80" w:after="80"/>
-        <w:pBdr>
-          <w:bottom w:val="single" w:sz="6" w:space="1" w:color="C7D2E8"/>
-        </w:pBdr>
-      </w:pPr>
-    </w:p>
-    <w:p>
-      <w:pPr>
         <w:spacing w:before="280" w:after="120"/>
       </w:pPr>
       <w:r>
@@ -1044,19 +750,6 @@
           <w:sz w:val="32"/>
         </w:rPr>
         <w:t>Folie 9 – Lotto 6 aus 45 (Simon Schick)</w:t>
-      </w:r>
-    </w:p>
-    <w:p>
-      <w:pPr>
-        <w:spacing w:after="160"/>
-      </w:pPr>
-      <w:r>
-        <w:rPr>
-          <w:i/>
-          <w:color w:val="64748B"/>
-          <w:sz w:val="21"/>
-        </w:rPr>
-        <w:t>~80 Sek.</w:t>
       </w:r>
     </w:p>
     <w:p>
@@ -1141,14 +834,6 @@
     </w:p>
     <w:p>
       <w:pPr>
-        <w:spacing w:before="80" w:after="80"/>
-        <w:pBdr>
-          <w:bottom w:val="single" w:sz="6" w:space="1" w:color="C7D2E8"/>
-        </w:pBdr>
-      </w:pPr>
-    </w:p>
-    <w:p>
-      <w:pPr>
         <w:spacing w:before="280" w:after="120"/>
       </w:pPr>
       <w:r>
@@ -1158,19 +843,6 @@
           <w:sz w:val="32"/>
         </w:rPr>
         <w:t>Folie 10 – Praktischer Teil: Estimation-Spiel (Daniel Kornfeld)</w:t>
-      </w:r>
-    </w:p>
-    <w:p>
-      <w:pPr>
-        <w:spacing w:after="160"/>
-      </w:pPr>
-      <w:r>
-        <w:rPr>
-          <w:i/>
-          <w:color w:val="64748B"/>
-          <w:sz w:val="21"/>
-        </w:rPr>
-        <w:t>~40 Sek.</w:t>
       </w:r>
     </w:p>
     <w:p>
@@ -1235,14 +907,6 @@
     </w:p>
     <w:p>
       <w:pPr>
-        <w:spacing w:before="80" w:after="80"/>
-        <w:pBdr>
-          <w:bottom w:val="single" w:sz="6" w:space="1" w:color="C7D2E8"/>
-        </w:pBdr>
-      </w:pPr>
-    </w:p>
-    <w:p>
-      <w:pPr>
         <w:spacing w:before="280" w:after="120"/>
       </w:pPr>
       <w:r>
@@ -1252,19 +916,6 @@
           <w:sz w:val="32"/>
         </w:rPr>
         <w:t>Folie 11 – Runde 1: Eure Schätzung (Max Manahl)</w:t>
-      </w:r>
-    </w:p>
-    <w:p>
-      <w:pPr>
-        <w:spacing w:after="160"/>
-      </w:pPr>
-      <w:r>
-        <w:rPr>
-          <w:i/>
-          <w:color w:val="64748B"/>
-          <w:sz w:val="21"/>
-        </w:rPr>
-        <w:t>~60 Sek.</w:t>
       </w:r>
     </w:p>
     <w:p>
@@ -1289,19 +940,6 @@
     </w:p>
     <w:p>
       <w:pPr>
-        <w:spacing w:after="200"/>
-      </w:pPr>
-      <w:r>
-        <w:rPr>
-          <w:i/>
-          <w:color w:val="64748B"/>
-          <w:sz w:val="21"/>
-        </w:rPr>
-        <w:t>[30–45 Sekunden Zeit zum Schätzen geben]</w:t>
-      </w:r>
-    </w:p>
-    <w:p>
-      <w:pPr>
         <w:spacing w:after="200" w:line="300" w:lineRule="auto"/>
       </w:pPr>
       <w:r>
@@ -1317,49 +955,8 @@
           <w:color w:val="0F172A"/>
           <w:sz w:val="23"/>
         </w:rPr>
-        <w:t>Schreibt's auf oder merkt's euch gut, wir vergleichen gleich.</w:t>
+        <w:t>Schreibt's auf oder merkt's euch gut, wir vergleichen gleich. Simon löst auf.</w:t>
       </w:r>
-    </w:p>
-    <w:p>
-      <w:pPr>
-        <w:spacing w:after="200"/>
-      </w:pPr>
-      <w:r>
-        <w:rPr>
-          <w:i/>
-          <w:color w:val="64748B"/>
-          <w:sz w:val="21"/>
-        </w:rPr>
-        <w:t>[kurze Handzeichen-Abfrage: 'Wer schätzt unter 1.000? Unter 1 Million? Über 1 Milliarde?']</w:t>
-      </w:r>
-    </w:p>
-    <w:p>
-      <w:pPr>
-        <w:spacing w:after="200" w:line="300" w:lineRule="auto"/>
-      </w:pPr>
-      <w:r>
-        <w:rPr>
-          <w:b/>
-          <w:color w:val="1E3A8A"/>
-          <w:sz w:val="23"/>
-        </w:rPr>
-        <w:t xml:space="preserve">Max: </w:t>
-      </w:r>
-      <w:r>
-        <w:rPr>
-          <w:color w:val="0F172A"/>
-          <w:sz w:val="23"/>
-        </w:rPr>
-        <w:t>Simon löst auf.</w:t>
-      </w:r>
-    </w:p>
-    <w:p>
-      <w:pPr>
-        <w:spacing w:before="80" w:after="80"/>
-        <w:pBdr>
-          <w:bottom w:val="single" w:sz="6" w:space="1" w:color="C7D2E8"/>
-        </w:pBdr>
-      </w:pPr>
     </w:p>
     <w:p>
       <w:pPr>
@@ -1372,19 +969,6 @@
           <w:sz w:val="32"/>
         </w:rPr>
         <w:t>Folie 12 – Runde 1: Auflösung (Simon Schick)</w:t>
-      </w:r>
-    </w:p>
-    <w:p>
-      <w:pPr>
-        <w:spacing w:after="160"/>
-      </w:pPr>
-      <w:r>
-        <w:rPr>
-          <w:i/>
-          <w:color w:val="64748B"/>
-          <w:sz w:val="21"/>
-        </w:rPr>
-        <w:t>~70 Sek.</w:t>
       </w:r>
     </w:p>
     <w:p>
@@ -1404,20 +988,7 @@
           <w:color w:val="0F172A"/>
           <w:sz w:val="23"/>
         </w:rPr>
-        <w:t>Das ist genau die Permutation von 15 Personen, P(15) gleich 15 Fakultät. Und 15 Fakultät ist...</w:t>
-      </w:r>
-    </w:p>
-    <w:p>
-      <w:pPr>
-        <w:spacing w:after="200"/>
-      </w:pPr>
-      <w:r>
-        <w:rPr>
-          <w:i/>
-          <w:color w:val="64748B"/>
-          <w:sz w:val="21"/>
-        </w:rPr>
-        <w:t>[kurze Pause, auf die Folie zeigen]</w:t>
+        <w:t>Das ist genau die Permutation von 15 Personen, P(15) gleich 15 Fakultät. Und 15 Fakultät ist 1.307.674.368.000. Über 1,3 Billionen.</w:t>
       </w:r>
     </w:p>
     <w:p>
@@ -1437,7 +1008,7 @@
           <w:color w:val="0F172A"/>
           <w:sz w:val="23"/>
         </w:rPr>
-        <w:t>...1.307.674.368.000. Über 1,3 Billionen. Damit ihr ein Gefühl dafür kriegt: Stellt euch vor, ihr probiert ab jetzt eine Reihenfolge pro Sekunde durch, ohne Pause. Wie lange würde das dauern, bis wirklich alle durch sind? Ungefähr 41.466 Jahre. Hätte man damit heute angefangen, wäre man bei ca. 39.000 vor Christus gestartet – das ist die Steinzeit, da gab's noch nicht mal Schrift oder Landwirtschaft.</w:t>
+        <w:t>Damit ihr ein Gefühl dafür kriegt: Stellt euch vor, ihr probiert ab jetzt eine Reihenfolge pro Sekunde durch, ohne Pause. Wie lange würde das dauern, bis wirklich alle durch sind? Ungefähr 41.466 Jahre. Hätte man damit heute angefangen, wäre man bei ca. 39.000 vor Christus gestartet – das ist die Steinzeit, da gab's noch nicht mal Schrift oder Landwirtschaft.</w:t>
       </w:r>
     </w:p>
     <w:p>
@@ -1462,14 +1033,6 @@
     </w:p>
     <w:p>
       <w:pPr>
-        <w:spacing w:before="80" w:after="80"/>
-        <w:pBdr>
-          <w:bottom w:val="single" w:sz="6" w:space="1" w:color="C7D2E8"/>
-        </w:pBdr>
-      </w:pPr>
-    </w:p>
-    <w:p>
-      <w:pPr>
         <w:spacing w:before="280" w:after="120"/>
       </w:pPr>
       <w:r>
@@ -1479,19 +1042,6 @@
           <w:sz w:val="32"/>
         </w:rPr>
         <w:t>Folie 13 – Runde 2: Eure Schätzung (Daniel Kornfeld)</w:t>
-      </w:r>
-    </w:p>
-    <w:p>
-      <w:pPr>
-        <w:spacing w:after="160"/>
-      </w:pPr>
-      <w:r>
-        <w:rPr>
-          <w:i/>
-          <w:color w:val="64748B"/>
-          <w:sz w:val="21"/>
-        </w:rPr>
-        <w:t>~60 Sek.</w:t>
       </w:r>
     </w:p>
     <w:p>
@@ -1531,62 +1081,8 @@
           <w:color w:val="0F172A"/>
           <w:sz w:val="23"/>
         </w:rPr>
-        <w:t>Kleiner Tipp: Das ist eine Permutation von 52 Elementen, also P(52) gleich 52 Fakultät.</w:t>
+        <w:t>Kleiner Tipp: Das ist eine Permutation von 52 Elementen, also P(52) gleich 52 Fakultät. Max löst auf.</w:t>
       </w:r>
-    </w:p>
-    <w:p>
-      <w:pPr>
-        <w:spacing w:after="200"/>
-      </w:pPr>
-      <w:r>
-        <w:rPr>
-          <w:i/>
-          <w:color w:val="64748B"/>
-          <w:sz w:val="21"/>
-        </w:rPr>
-        <w:t>[Zeit zum Schätzen geben]</w:t>
-      </w:r>
-    </w:p>
-    <w:p>
-      <w:pPr>
-        <w:spacing w:after="200"/>
-      </w:pPr>
-      <w:r>
-        <w:rPr>
-          <w:i/>
-          <w:color w:val="64748B"/>
-          <w:sz w:val="21"/>
-        </w:rPr>
-        <w:t>[Handzeichen-Abfrage: 'Wer sagt mehr als 1.000? 1 Million? 1 Milliarde? 1 Trillion?']</w:t>
-      </w:r>
-    </w:p>
-    <w:p>
-      <w:pPr>
-        <w:spacing w:after="200" w:line="300" w:lineRule="auto"/>
-      </w:pPr>
-      <w:r>
-        <w:rPr>
-          <w:b/>
-          <w:color w:val="2563EB"/>
-          <w:sz w:val="23"/>
-        </w:rPr>
-        <w:t xml:space="preserve">Daniel: </w:t>
-      </w:r>
-      <w:r>
-        <w:rPr>
-          <w:color w:val="0F172A"/>
-          <w:sz w:val="23"/>
-        </w:rPr>
-        <w:t>Max löst auf.</w:t>
-      </w:r>
-    </w:p>
-    <w:p>
-      <w:pPr>
-        <w:spacing w:before="80" w:after="80"/>
-        <w:pBdr>
-          <w:bottom w:val="single" w:sz="6" w:space="1" w:color="C7D2E8"/>
-        </w:pBdr>
-      </w:pPr>
     </w:p>
     <w:p>
       <w:pPr>
@@ -1599,19 +1095,6 @@
           <w:sz w:val="32"/>
         </w:rPr>
         <w:t>Folie 14 – Runde 2: Auflösung (Max Manahl)</w:t>
-      </w:r>
-    </w:p>
-    <w:p>
-      <w:pPr>
-        <w:spacing w:after="160"/>
-      </w:pPr>
-      <w:r>
-        <w:rPr>
-          <w:i/>
-          <w:color w:val="64748B"/>
-          <w:sz w:val="21"/>
-        </w:rPr>
-        <w:t>~80 Sek.</w:t>
       </w:r>
     </w:p>
     <w:p>
@@ -1676,14 +1159,6 @@
     </w:p>
     <w:p>
       <w:pPr>
-        <w:spacing w:before="80" w:after="80"/>
-        <w:pBdr>
-          <w:bottom w:val="single" w:sz="6" w:space="1" w:color="C7D2E8"/>
-        </w:pBdr>
-      </w:pPr>
-    </w:p>
-    <w:p>
-      <w:pPr>
         <w:spacing w:before="280" w:after="120"/>
       </w:pPr>
       <w:r>
@@ -1693,19 +1168,6 @@
           <w:sz w:val="32"/>
         </w:rPr>
         <w:t>Folie 15 – Übersichtstabelle (Simon Schick)</w:t>
-      </w:r>
-    </w:p>
-    <w:p>
-      <w:pPr>
-        <w:spacing w:after="160"/>
-      </w:pPr>
-      <w:r>
-        <w:rPr>
-          <w:i/>
-          <w:color w:val="64748B"/>
-          <w:sz w:val="21"/>
-        </w:rPr>
-        <w:t>~70 Sek.</w:t>
       </w:r>
     </w:p>
     <w:p>
@@ -1790,14 +1252,6 @@
     </w:p>
     <w:p>
       <w:pPr>
-        <w:spacing w:before="80" w:after="80"/>
-        <w:pBdr>
-          <w:bottom w:val="single" w:sz="6" w:space="1" w:color="C7D2E8"/>
-        </w:pBdr>
-      </w:pPr>
-    </w:p>
-    <w:p>
-      <w:pPr>
         <w:spacing w:before="280" w:after="120"/>
       </w:pPr>
       <w:r>
@@ -1807,19 +1261,6 @@
           <w:sz w:val="32"/>
         </w:rPr>
         <w:t>Folie 16 – Zusammenfassung (Alle)</w:t>
-      </w:r>
-    </w:p>
-    <w:p>
-      <w:pPr>
-        <w:spacing w:after="160"/>
-      </w:pPr>
-      <w:r>
-        <w:rPr>
-          <w:i/>
-          <w:color w:val="64748B"/>
-          <w:sz w:val="21"/>
-        </w:rPr>
-        <w:t>~60 Sek.</w:t>
       </w:r>
     </w:p>
     <w:p>
@@ -1884,14 +1325,6 @@
     </w:p>
     <w:p>
       <w:pPr>
-        <w:spacing w:before="80" w:after="80"/>
-        <w:pBdr>
-          <w:bottom w:val="single" w:sz="6" w:space="1" w:color="C7D2E8"/>
-        </w:pBdr>
-      </w:pPr>
-    </w:p>
-    <w:p>
-      <w:pPr>
         <w:spacing w:before="280" w:after="120"/>
       </w:pPr>
       <w:r>
@@ -1901,19 +1334,6 @@
           <w:sz w:val="32"/>
         </w:rPr>
         <w:t>Folie 17 – Quellen (Alle)</w:t>
-      </w:r>
-    </w:p>
-    <w:p>
-      <w:pPr>
-        <w:spacing w:after="160"/>
-      </w:pPr>
-      <w:r>
-        <w:rPr>
-          <w:i/>
-          <w:color w:val="64748B"/>
-          <w:sz w:val="21"/>
-        </w:rPr>
-        <w:t>~20 Sek.</w:t>
       </w:r>
     </w:p>
     <w:p>
@@ -1938,14 +1358,6 @@
     </w:p>
     <w:p>
       <w:pPr>
-        <w:spacing w:before="80" w:after="80"/>
-        <w:pBdr>
-          <w:bottom w:val="single" w:sz="6" w:space="1" w:color="C7D2E8"/>
-        </w:pBdr>
-      </w:pPr>
-    </w:p>
-    <w:p>
-      <w:pPr>
         <w:spacing w:before="280" w:after="120"/>
       </w:pPr>
       <w:r>
@@ -1955,19 +1367,6 @@
           <w:sz w:val="32"/>
         </w:rPr>
         <w:t>Folie 18 – Danke / Fragen (Alle)</w:t>
-      </w:r>
-    </w:p>
-    <w:p>
-      <w:pPr>
-        <w:spacing w:after="160"/>
-      </w:pPr>
-      <w:r>
-        <w:rPr>
-          <w:i/>
-          <w:color w:val="64748B"/>
-          <w:sz w:val="21"/>
-        </w:rPr>
-        <w:t>~20 Sek.</w:t>
       </w:r>
     </w:p>
     <w:p>
@@ -2028,53 +1427,6 @@
           <w:sz w:val="23"/>
         </w:rPr>
         <w:t>Habt ihr noch Fragen? Oder sagt uns – was war eure überraschendste Zahl heute?</w:t>
-      </w:r>
-    </w:p>
-    <w:p>
-      <w:pPr>
-        <w:spacing w:before="80" w:after="80"/>
-        <w:pBdr>
-          <w:bottom w:val="single" w:sz="6" w:space="1" w:color="C7D2E8"/>
-        </w:pBdr>
-      </w:pPr>
-    </w:p>
-    <w:p>
-      <w:pPr>
-        <w:spacing w:before="280" w:after="120"/>
-      </w:pPr>
-      <w:r>
-        <w:rPr>
-          <w:b/>
-          <w:color w:val="1E3A8A"/>
-          <w:sz w:val="28"/>
-        </w:rPr>
-        <w:t>Gesamtdauer-Check</w:t>
-      </w:r>
-    </w:p>
-    <w:p>
-      <w:pPr>
-        <w:spacing w:after="200"/>
-      </w:pPr>
-      <w:r>
-        <w:rPr>
-          <w:sz w:val="22"/>
-        </w:rPr>
-        <w:t>Reine Sprechzeit liegt bei ca. 20-21 Minuten. Mit den Pausen fürs Schätzspiel (Runde 1 + Runde 2, je 30-60 Sek. Stille plus kurze Handzeichen-Abfrage) und etwas Luft zum normalen Reden kommt ihr realistisch auf 22-25 Minuten – genau im Zielbereich.</w:t>
-      </w:r>
-    </w:p>
-    <w:p>
-      <w:r>
-        <w:rPr>
-          <w:b/>
-          <w:sz w:val="22"/>
-        </w:rPr>
-        <w:t xml:space="preserve">Tipp: </w:t>
-      </w:r>
-      <w:r>
-        <w:rPr>
-          <w:sz w:val="22"/>
-        </w:rPr>
-        <w:t>Lernt nicht den ganzen Text auswendig, sondern nur den letzten Satz der eigenen Folie und den ersten Satz der eigenen nächsten Folie – den Rest erzählt einfach mit eigenen Worten. Übergaben wie 'Simon löst auf' oder 'Daniel zeigt euch...' kurz und beiläufig sagen, nicht wie eine Ansage.</w:t>
       </w:r>
     </w:p>
     <w:sectPr>

</xml_diff>